<commit_message>
Finalize P6 P7 robustness checks
</commit_message>
<xml_diff>
--- a/output/doc/2026年辽宁省大学生计算机博弈大赛_程序设计说明书_包瀚宇.docx
+++ b/output/doc/2026年辽宁省大学生计算机博弈大赛_程序设计说明书_包瀚宇.docx
@@ -1066,7 +1066,7 @@
       </w:tblGrid>
       <w:tr>
         <w:trPr>
-          <w:trHeight w:val="12925"/>
+          <w:trHeight w:val="1550"/>
         </w:trPr>
         <w:tc>
           <w:tcPr>
@@ -1114,7 +1114,7 @@
               <w:rPr>
                 <w:sz w:val="24"/>
               </w:rPr>
-              <w:t>年辽宁省大学生计算机博弈大赛暨中国大学生计算机博弈大赛辽宁选拔赛爱恩斯坦棋项目开发，目标是形成一个可在比赛现场离线运行、规则正确、操作稳定并具备基础智能决策能力的参赛程序。项目起初以规则建模为核心，优先实现</w:t>
+              <w:t>年辽宁省大学生计算机博弈大赛暨中国大学生计算机博弈大赛辽宁选拔赛爱恩斯坦棋项目开发，目标是形成一个可在比赛现场离线运行、规则正确、操作稳定并具备数据化智能决策能力的参赛程序。项目起初以规则建模为核心，优先实现</w:t>
             </w:r>
             <w:r>
               <w:rPr>
@@ -1150,7 +1150,7 @@
               <w:rPr>
                 <w:sz w:val="24"/>
               </w:rPr>
-              <w:t>号棋子、骰子点数映射、合法走法、吃子、胜负判断、走子与撤销等基础能力。随后在核心规则稳定的基础上，逐步加入</w:t>
+              <w:t>号棋子、骰子点数映射、合法走法、吃子（含吃本方棋子）、胜负判断、走子与撤销等基础能力。随后在核心规则稳定的基础上，逐步加入</w:t>
             </w:r>
             <w:r>
               <w:rPr>
@@ -1186,7 +1186,43 @@
               <w:rPr>
                 <w:sz w:val="24"/>
               </w:rPr>
-              <w:t>分钟包干计时、自动保存恢复以及七盘制比赛流程。</w:t>
+              <w:t>分钟包干计时、自动保存恢复以及七盘制比赛流程。后续又完成</w:t>
+            </w:r>
+            <w:r>
+              <w:rPr>
+                <w:sz w:val="24"/>
+              </w:rPr>
+              <w:t>RolloutAI</w:t>
+            </w:r>
+            <w:r>
+              <w:rPr>
+                <w:sz w:val="24"/>
+              </w:rPr>
+              <w:t>默认参数晋升、</w:t>
+            </w:r>
+            <w:r>
+              <w:rPr>
+                <w:sz w:val="24"/>
+              </w:rPr>
+              <w:t>MCTS</w:t>
+            </w:r>
+            <w:r>
+              <w:rPr>
+                <w:sz w:val="24"/>
+              </w:rPr>
+              <w:t>实验验证、开局布局搜索与候选布局双边复验，最终保持稳定的</w:t>
+            </w:r>
+            <w:r>
+              <w:rPr>
+                <w:sz w:val="24"/>
+              </w:rPr>
+              <w:t>release</w:t>
+            </w:r>
+            <w:r>
+              <w:rPr>
+                <w:sz w:val="24"/>
+              </w:rPr>
+              <w:t>默认配置，不因小样本波动临时替换比赛路径。</w:t>
             </w:r>
           </w:p>
           <w:p>
@@ -1287,6 +1323,9 @@
               <w:spacing w:line="360" w:lineRule="auto"/>
               <w:ind w:firstLine="480"/>
               <w:jc w:val="left"/>
+              <w:rPr>
+                <w:sz w:val="24"/>
+              </w:rPr>
             </w:pPr>
             <w:r>
               <w:rPr>
@@ -1358,7 +1397,20 @@
               <w:rPr>
                 <w:sz w:val="24"/>
               </w:rPr>
-              <w:t xml:space="preserve"> .venv/Scripts/python.exe scripts/run_gui.py</w:t>
+              <w:t xml:space="preserve"> .venv/Scripts/python.exe</w:t>
+            </w:r>
+            <w:r>
+              <w:rPr>
+                <w:rFonts w:hint="eastAsia"/>
+                <w:sz w:val="24"/>
+              </w:rPr>
+              <w:t>、</w:t>
+            </w:r>
+            <w:r>
+              <w:rPr>
+                <w:sz w:val="24"/>
+              </w:rPr>
+              <w:t>scripts/run_gui.py</w:t>
             </w:r>
             <w:r>
               <w:rPr>
@@ -1388,7 +1440,7 @@
               <w:rPr>
                 <w:sz w:val="24"/>
               </w:rPr>
-              <w:t>和</w:t>
+              <w:t>、</w:t>
             </w:r>
             <w:r>
               <w:rPr>
@@ -1400,7 +1452,55 @@
               <w:rPr>
                 <w:sz w:val="24"/>
               </w:rPr>
-              <w:t>。</w:t>
+              <w:t>，以及</w:t>
+            </w:r>
+            <w:r>
+              <w:rPr>
+                <w:sz w:val="24"/>
+              </w:rPr>
+              <w:t>quick_bench</w:t>
+            </w:r>
+            <w:r>
+              <w:rPr>
+                <w:sz w:val="24"/>
+              </w:rPr>
+              <w:t>、</w:t>
+            </w:r>
+            <w:r>
+              <w:rPr>
+                <w:sz w:val="24"/>
+              </w:rPr>
+              <w:t>bench_ai</w:t>
+            </w:r>
+            <w:r>
+              <w:rPr>
+                <w:sz w:val="24"/>
+              </w:rPr>
+              <w:t>、</w:t>
+            </w:r>
+            <w:r>
+              <w:rPr>
+                <w:sz w:val="24"/>
+              </w:rPr>
+              <w:t>search_openings</w:t>
+            </w:r>
+            <w:r>
+              <w:rPr>
+                <w:sz w:val="24"/>
+              </w:rPr>
+              <w:t>、</w:t>
+            </w:r>
+            <w:r>
+              <w:rPr>
+                <w:sz w:val="24"/>
+              </w:rPr>
+              <w:t>compare_opening_layouts</w:t>
+            </w:r>
+            <w:r>
+              <w:rPr>
+                <w:sz w:val="24"/>
+              </w:rPr>
+              <w:t>等本地评测脚本。</w:t>
             </w:r>
           </w:p>
           <w:p>
@@ -1551,7 +1651,14 @@
               <w:rPr>
                 <w:sz w:val="24"/>
               </w:rPr>
-              <w:t>手动测试记录、比赛流程清单整理和说明书文字校对等工作。</w:t>
+              <w:t>手动测试记录、比赛流程清单整</w:t>
+            </w:r>
+            <w:r>
+              <w:rPr>
+                <w:sz w:val="24"/>
+              </w:rPr>
+              <w:lastRenderedPageBreak/>
+              <w:t>理和说明书文字校对等工作。</w:t>
             </w:r>
           </w:p>
           <w:p>
@@ -1740,7 +1847,7 @@
               <w:rPr>
                 <w:sz w:val="24"/>
               </w:rPr>
-              <w:t xml:space="preserve"> AI</w:t>
+              <w:t>AI</w:t>
             </w:r>
             <w:r>
               <w:rPr>
@@ -1752,13 +1859,13 @@
               <w:rPr>
                 <w:sz w:val="24"/>
               </w:rPr>
-              <w:t xml:space="preserve"> MCTS</w:t>
-            </w:r>
-            <w:r>
-              <w:rPr>
-                <w:sz w:val="24"/>
-              </w:rPr>
-              <w:t>、战术规则补丁、评估函数、验证流程与对战引擎等多个维度。下文按编号分述。</w:t>
+              <w:t>MCTS</w:t>
+            </w:r>
+            <w:r>
+              <w:rPr>
+                <w:sz w:val="24"/>
+              </w:rPr>
+              <w:t>、战术规则补丁、评估函数、开局布局搜索、验证流程与对战引擎等多个维度。下文按编号分述。</w:t>
             </w:r>
           </w:p>
           <w:p>
@@ -1783,6 +1890,7 @@
           <w:p>
             <w:pPr>
               <w:spacing w:line="360" w:lineRule="auto"/>
+              <w:ind w:firstLineChars="100" w:firstLine="240"/>
             </w:pPr>
             <w:r>
               <w:rPr>
@@ -1962,7 +2070,31 @@
               <w:rPr>
                 <w:sz w:val="24"/>
               </w:rPr>
-              <w:t xml:space="preserve">rollout_tactical </w:t>
+              <w:t>rollout_tactical</w:t>
+            </w:r>
+            <w:r>
+              <w:rPr>
+                <w:sz w:val="24"/>
+              </w:rPr>
+              <w:t>、</w:t>
+            </w:r>
+            <w:r>
+              <w:rPr>
+                <w:sz w:val="24"/>
+              </w:rPr>
+              <w:t>greedy_zweistein</w:t>
+            </w:r>
+            <w:r>
+              <w:rPr>
+                <w:sz w:val="24"/>
+              </w:rPr>
+              <w:t>、</w:t>
+            </w:r>
+            <w:r>
+              <w:rPr>
+                <w:sz w:val="24"/>
+              </w:rPr>
+              <w:t xml:space="preserve">rollout_zweistein_cutoff </w:t>
             </w:r>
             <w:r>
               <w:rPr>
@@ -1980,37 +2112,13 @@
               <w:rPr>
                 <w:sz w:val="24"/>
               </w:rPr>
-              <w:t>是在</w:t>
-            </w:r>
-            <w:r>
-              <w:rPr>
-                <w:sz w:val="24"/>
-              </w:rPr>
-              <w:t xml:space="preserve"> GreedyAI </w:t>
-            </w:r>
-            <w:r>
-              <w:rPr>
-                <w:sz w:val="24"/>
-              </w:rPr>
-              <w:t>基础上注入风险权重得到的风险感知贪心策略；</w:t>
-            </w:r>
-            <w:r>
-              <w:rPr>
-                <w:sz w:val="24"/>
-              </w:rPr>
-              <w:t xml:space="preserve">rollout </w:t>
-            </w:r>
-            <w:r>
-              <w:rPr>
-                <w:sz w:val="24"/>
-              </w:rPr>
-              <w:t>是</w:t>
-            </w:r>
-            <w:r>
-              <w:rPr>
-                <w:sz w:val="24"/>
-              </w:rPr>
-              <w:t xml:space="preserve"> release/v1.0 </w:t>
+              <w:t>保留为应急回退；</w:t>
+            </w:r>
+            <w:r>
+              <w:rPr>
+                <w:sz w:val="24"/>
+              </w:rPr>
+              <w:t xml:space="preserve">release/v1.0 </w:t>
             </w:r>
             <w:r>
               <w:rPr>
@@ -2022,13 +2130,49 @@
               <w:rPr>
                 <w:sz w:val="24"/>
               </w:rPr>
-              <w:t xml:space="preserve"> AI</w:t>
-            </w:r>
-            <w:r>
-              <w:rPr>
-                <w:sz w:val="24"/>
-              </w:rPr>
-              <w:t>；</w:t>
+              <w:t xml:space="preserve"> AI </w:t>
+            </w:r>
+            <w:r>
+              <w:rPr>
+                <w:sz w:val="24"/>
+              </w:rPr>
+              <w:t>仍使用</w:t>
+            </w:r>
+            <w:r>
+              <w:rPr>
+                <w:sz w:val="24"/>
+              </w:rPr>
+              <w:t xml:space="preserve"> rollout kind</w:t>
+            </w:r>
+            <w:r>
+              <w:rPr>
+                <w:sz w:val="24"/>
+              </w:rPr>
+              <w:t>，但参数已替换为</w:t>
+            </w:r>
+            <w:r>
+              <w:rPr>
+                <w:sz w:val="24"/>
+              </w:rPr>
+              <w:t>P3 promotion</w:t>
+            </w:r>
+            <w:r>
+              <w:rPr>
+                <w:sz w:val="24"/>
+              </w:rPr>
+              <w:t>通过的</w:t>
+            </w:r>
+            <w:r>
+              <w:rPr>
+                <w:sz w:val="24"/>
+              </w:rPr>
+              <w:t>risk-aware playout + Zweistein cutoff</w:t>
+            </w:r>
+            <w:r>
+              <w:rPr>
+                <w:sz w:val="24"/>
+              </w:rPr>
+              <w:t>配置；</w:t>
             </w:r>
             <w:r>
               <w:rPr>
@@ -2121,21 +2265,460 @@
                 <w:b/>
                 <w:sz w:val="24"/>
               </w:rPr>
-              <w:t>：</w:t>
+              <w:t>：晋升后的</w:t>
             </w:r>
             <w:r>
               <w:rPr>
                 <w:b/>
                 <w:sz w:val="24"/>
               </w:rPr>
+              <w:t xml:space="preserve"> RolloutAI </w:t>
+            </w:r>
+            <w:r>
+              <w:rPr>
+                <w:b/>
+                <w:sz w:val="24"/>
+              </w:rPr>
+              <w:t>平面蒙特卡洛</w:t>
+            </w:r>
+          </w:p>
+          <w:p>
+            <w:pPr>
+              <w:spacing w:line="360" w:lineRule="auto"/>
+              <w:ind w:firstLineChars="100" w:firstLine="240"/>
+            </w:pPr>
+            <w:r>
+              <w:rPr>
+                <w:sz w:val="24"/>
+              </w:rPr>
               <w:t xml:space="preserve">RolloutAI </w:t>
             </w:r>
             <w:r>
               <w:rPr>
-                <w:b/>
-                <w:sz w:val="24"/>
-              </w:rPr>
-              <w:t>平面蒙特卡洛</w:t>
+                <w:sz w:val="24"/>
+              </w:rPr>
+              <w:t>是</w:t>
+            </w:r>
+            <w:r>
+              <w:rPr>
+                <w:sz w:val="24"/>
+              </w:rPr>
+              <w:t xml:space="preserve"> release/v1.0 </w:t>
+            </w:r>
+            <w:r>
+              <w:rPr>
+                <w:sz w:val="24"/>
+              </w:rPr>
+              <w:t>的默认引擎，对每个合法走法独立执行多次模拟并取平均胜率。当前默认参数来自</w:t>
+            </w:r>
+            <w:r>
+              <w:rPr>
+                <w:sz w:val="24"/>
+              </w:rPr>
+              <w:t>P3 promotion</w:t>
+            </w:r>
+            <w:r>
+              <w:rPr>
+                <w:sz w:val="24"/>
+              </w:rPr>
+              <w:t>通过的</w:t>
+            </w:r>
+            <w:r>
+              <w:rPr>
+                <w:sz w:val="24"/>
+              </w:rPr>
+              <w:t>rollout_zweistein_cutoff</w:t>
+            </w:r>
+            <w:r>
+              <w:rPr>
+                <w:sz w:val="24"/>
+              </w:rPr>
+              <w:t>配置：每走法模拟</w:t>
+            </w:r>
+            <w:r>
+              <w:rPr>
+                <w:sz w:val="24"/>
+              </w:rPr>
+              <w:t>32</w:t>
+            </w:r>
+            <w:r>
+              <w:rPr>
+                <w:sz w:val="24"/>
+              </w:rPr>
+              <w:t>次；单步时间预算</w:t>
+            </w:r>
+            <w:r>
+              <w:rPr>
+                <w:sz w:val="24"/>
+              </w:rPr>
+              <w:t>750 ms</w:t>
+            </w:r>
+            <w:r>
+              <w:rPr>
+                <w:sz w:val="24"/>
+              </w:rPr>
+              <w:t>，并设置</w:t>
+            </w:r>
+            <w:r>
+              <w:rPr>
+                <w:sz w:val="24"/>
+              </w:rPr>
+              <w:t>30 ms deadline safety</w:t>
+            </w:r>
+            <w:r>
+              <w:rPr>
+                <w:sz w:val="24"/>
+              </w:rPr>
+              <w:t>；单局</w:t>
+            </w:r>
+            <w:r>
+              <w:rPr>
+                <w:sz w:val="24"/>
+              </w:rPr>
+              <w:t>rollout</w:t>
+            </w:r>
+            <w:r>
+              <w:rPr>
+                <w:sz w:val="24"/>
+              </w:rPr>
+              <w:t>最大步数</w:t>
+            </w:r>
+            <w:r>
+              <w:rPr>
+                <w:sz w:val="24"/>
+              </w:rPr>
+              <w:t>80</w:t>
+            </w:r>
+            <w:r>
+              <w:rPr>
+                <w:sz w:val="24"/>
+              </w:rPr>
+              <w:t>；</w:t>
+            </w:r>
+            <w:r>
+              <w:rPr>
+                <w:sz w:val="24"/>
+              </w:rPr>
+              <w:t>playout</w:t>
+            </w:r>
+            <w:r>
+              <w:rPr>
+                <w:sz w:val="24"/>
+              </w:rPr>
+              <w:t>阶段使用</w:t>
+            </w:r>
+            <w:r>
+              <w:rPr>
+                <w:sz w:val="24"/>
+              </w:rPr>
+              <w:t>greedy_risk</w:t>
+            </w:r>
+            <w:r>
+              <w:rPr>
+                <w:sz w:val="24"/>
+              </w:rPr>
+              <w:t>策略并叠加</w:t>
+            </w:r>
+            <w:r>
+              <w:rPr>
+                <w:sz w:val="24"/>
+              </w:rPr>
+              <w:t>ε-greedy</w:t>
+            </w:r>
+            <w:r>
+              <w:rPr>
+                <w:sz w:val="24"/>
+              </w:rPr>
+              <w:t>探索（</w:t>
+            </w:r>
+            <w:r>
+              <w:rPr>
+                <w:sz w:val="24"/>
+              </w:rPr>
+              <w:t>ε = 0.10</w:t>
+            </w:r>
+            <w:r>
+              <w:rPr>
+                <w:sz w:val="24"/>
+              </w:rPr>
+              <w:t>）；对接近候选使用</w:t>
+            </w:r>
+            <w:r>
+              <w:rPr>
+                <w:sz w:val="24"/>
+              </w:rPr>
+              <w:t>close sample</w:t>
+            </w:r>
+            <w:r>
+              <w:rPr>
+                <w:sz w:val="24"/>
+              </w:rPr>
+              <w:t>机制；</w:t>
+            </w:r>
+            <w:r>
+              <w:rPr>
+                <w:sz w:val="24"/>
+              </w:rPr>
+              <w:t>cutoff_eval</w:t>
+            </w:r>
+            <w:r>
+              <w:rPr>
+                <w:sz w:val="24"/>
+              </w:rPr>
+              <w:t>使用</w:t>
+            </w:r>
+            <w:r>
+              <w:rPr>
+                <w:sz w:val="24"/>
+              </w:rPr>
+              <w:t>Zweistein-lite</w:t>
+            </w:r>
+            <w:r>
+              <w:rPr>
+                <w:sz w:val="24"/>
+              </w:rPr>
+              <w:t>评估函数。若所有候选走法在预算内都无法完成有效模拟，程序仍回退到合法走法选择，保证现场始终输出合法且可解释的建议。</w:t>
+            </w:r>
+          </w:p>
+          <w:p>
+            <w:pPr>
+              <w:spacing w:line="360" w:lineRule="auto"/>
+              <w:ind w:firstLineChars="100" w:firstLine="240"/>
+            </w:pPr>
+            <w:r>
+              <w:rPr>
+                <w:sz w:val="24"/>
+              </w:rPr>
+              <w:t>实测数据：旧</w:t>
+            </w:r>
+            <w:r>
+              <w:rPr>
+                <w:sz w:val="24"/>
+              </w:rPr>
+              <w:t>flat rollout</w:t>
+            </w:r>
+            <w:r>
+              <w:rPr>
+                <w:sz w:val="24"/>
+              </w:rPr>
+              <w:t>曾在</w:t>
+            </w:r>
+            <w:r>
+              <w:rPr>
+                <w:sz w:val="24"/>
+              </w:rPr>
+              <w:t>release</w:t>
+            </w:r>
+            <w:r>
+              <w:rPr>
+                <w:sz w:val="24"/>
+              </w:rPr>
+              <w:t>验证中对</w:t>
+            </w:r>
+            <w:r>
+              <w:rPr>
+                <w:sz w:val="24"/>
+              </w:rPr>
+              <w:t>greedy_risk</w:t>
+            </w:r>
+            <w:r>
+              <w:rPr>
+                <w:sz w:val="24"/>
+              </w:rPr>
+              <w:t>双边</w:t>
+            </w:r>
+            <w:r>
+              <w:rPr>
+                <w:sz w:val="24"/>
+              </w:rPr>
+              <w:t>800</w:t>
+            </w:r>
+            <w:r>
+              <w:rPr>
+                <w:sz w:val="24"/>
+              </w:rPr>
+              <w:t>局合并胜率</w:t>
+            </w:r>
+            <w:r>
+              <w:rPr>
+                <w:sz w:val="24"/>
+              </w:rPr>
+              <w:lastRenderedPageBreak/>
+              <w:t>62.62%</w:t>
+            </w:r>
+            <w:r>
+              <w:rPr>
+                <w:sz w:val="24"/>
+              </w:rPr>
+              <w:t>。</w:t>
+            </w:r>
+            <w:r>
+              <w:rPr>
+                <w:sz w:val="24"/>
+              </w:rPr>
+              <w:t>P3</w:t>
+            </w:r>
+            <w:r>
+              <w:rPr>
+                <w:sz w:val="24"/>
+              </w:rPr>
+              <w:t>阶段的</w:t>
+            </w:r>
+            <w:r>
+              <w:rPr>
+                <w:sz w:val="24"/>
+              </w:rPr>
+              <w:t>rollout_zweistein_cutoff</w:t>
+            </w:r>
+            <w:r>
+              <w:rPr>
+                <w:sz w:val="24"/>
+              </w:rPr>
+              <w:t>对旧</w:t>
+            </w:r>
+            <w:r>
+              <w:rPr>
+                <w:sz w:val="24"/>
+              </w:rPr>
+              <w:t>flat rollout</w:t>
+            </w:r>
+            <w:r>
+              <w:rPr>
+                <w:sz w:val="24"/>
+              </w:rPr>
+              <w:t>进行</w:t>
+            </w:r>
+            <w:r>
+              <w:rPr>
+                <w:sz w:val="24"/>
+              </w:rPr>
+              <w:t>promotion</w:t>
+            </w:r>
+            <w:r>
+              <w:rPr>
+                <w:sz w:val="24"/>
+              </w:rPr>
+              <w:t>复验，双边</w:t>
+            </w:r>
+            <w:r>
+              <w:rPr>
+                <w:sz w:val="24"/>
+              </w:rPr>
+              <w:t>400+400</w:t>
+            </w:r>
+            <w:r>
+              <w:rPr>
+                <w:sz w:val="24"/>
+              </w:rPr>
+              <w:t>共</w:t>
+            </w:r>
+            <w:r>
+              <w:rPr>
+                <w:sz w:val="24"/>
+              </w:rPr>
+              <w:t>800</w:t>
+            </w:r>
+            <w:r>
+              <w:rPr>
+                <w:sz w:val="24"/>
+              </w:rPr>
+              <w:t>局，合并胜率</w:t>
+            </w:r>
+            <w:r>
+              <w:rPr>
+                <w:sz w:val="24"/>
+              </w:rPr>
+              <w:t>56.75%</w:t>
+            </w:r>
+            <w:r>
+              <w:rPr>
+                <w:sz w:val="24"/>
+              </w:rPr>
+              <w:t>，</w:t>
+            </w:r>
+            <w:r>
+              <w:rPr>
+                <w:sz w:val="24"/>
+              </w:rPr>
+              <w:t>Wilson</w:t>
+            </w:r>
+            <w:r>
+              <w:rPr>
+                <w:sz w:val="24"/>
+              </w:rPr>
+              <w:t>下界</w:t>
+            </w:r>
+            <w:r>
+              <w:rPr>
+                <w:sz w:val="24"/>
+              </w:rPr>
+              <w:t>53.29%</w:t>
+            </w:r>
+            <w:r>
+              <w:rPr>
+                <w:sz w:val="24"/>
+              </w:rPr>
+              <w:t>，且</w:t>
+            </w:r>
+            <w:r>
+              <w:rPr>
+                <w:sz w:val="24"/>
+              </w:rPr>
+              <w:t>0 illegal move</w:t>
+            </w:r>
+            <w:r>
+              <w:rPr>
+                <w:sz w:val="24"/>
+              </w:rPr>
+              <w:t>、</w:t>
+            </w:r>
+            <w:r>
+              <w:rPr>
+                <w:sz w:val="24"/>
+              </w:rPr>
+              <w:t>0 crash</w:t>
+            </w:r>
+            <w:r>
+              <w:rPr>
+                <w:sz w:val="24"/>
+              </w:rPr>
+              <w:t>、</w:t>
+            </w:r>
+            <w:r>
+              <w:rPr>
+                <w:sz w:val="24"/>
+              </w:rPr>
+              <w:t>0 timeout</w:t>
+            </w:r>
+            <w:r>
+              <w:rPr>
+                <w:sz w:val="24"/>
+              </w:rPr>
+              <w:t>。经用户批准后，该参数集已成为</w:t>
+            </w:r>
+            <w:r>
+              <w:rPr>
+                <w:sz w:val="24"/>
+              </w:rPr>
+              <w:t>GUI/release</w:t>
+            </w:r>
+            <w:r>
+              <w:rPr>
+                <w:sz w:val="24"/>
+              </w:rPr>
+              <w:t>工作默认；</w:t>
+            </w:r>
+            <w:r>
+              <w:rPr>
+                <w:sz w:val="24"/>
+              </w:rPr>
+              <w:t>greedy_risk</w:t>
+            </w:r>
+            <w:r>
+              <w:rPr>
+                <w:sz w:val="24"/>
+              </w:rPr>
+              <w:t>保留为应急回退。</w:t>
             </w:r>
           </w:p>
           <w:p>
@@ -2144,606 +2727,399 @@
             </w:pPr>
             <w:r>
               <w:rPr>
-                <w:sz w:val="24"/>
-              </w:rPr>
-              <w:t xml:space="preserve">RolloutAI </w:t>
-            </w:r>
-            <w:r>
-              <w:rPr>
-                <w:sz w:val="24"/>
-              </w:rPr>
-              <w:t>是</w:t>
-            </w:r>
-            <w:r>
-              <w:rPr>
-                <w:sz w:val="24"/>
-              </w:rPr>
-              <w:t xml:space="preserve"> release/v1.0 </w:t>
-            </w:r>
-            <w:r>
-              <w:rPr>
-                <w:sz w:val="24"/>
-              </w:rPr>
-              <w:t>的默认引擎，对每个合法走法独立执行多次随机模拟并取平均胜率。关键参数：每走法默认模拟</w:t>
-            </w:r>
-            <w:r>
-              <w:rPr>
-                <w:sz w:val="24"/>
-              </w:rPr>
-              <w:t xml:space="preserve"> 16 </w:t>
-            </w:r>
-            <w:r>
-              <w:rPr>
-                <w:sz w:val="24"/>
-              </w:rPr>
-              <w:t>次；单步时间预算</w:t>
-            </w:r>
-            <w:r>
-              <w:rPr>
-                <w:sz w:val="24"/>
-              </w:rPr>
-              <w:t xml:space="preserve"> 500 ms</w:t>
-            </w:r>
-            <w:r>
-              <w:rPr>
-                <w:sz w:val="24"/>
-              </w:rPr>
-              <w:t>，超时返回当前最佳；单局</w:t>
-            </w:r>
-            <w:r>
-              <w:rPr>
-                <w:sz w:val="24"/>
-              </w:rPr>
-              <w:t xml:space="preserve"> rollout </w:t>
-            </w:r>
-            <w:r>
-              <w:rPr>
-                <w:sz w:val="24"/>
-              </w:rPr>
-              <w:t>最大步数</w:t>
-            </w:r>
-            <w:r>
-              <w:rPr>
-                <w:sz w:val="24"/>
-              </w:rPr>
-              <w:t xml:space="preserve"> 80</w:t>
-            </w:r>
-            <w:r>
-              <w:rPr>
-                <w:sz w:val="24"/>
-              </w:rPr>
-              <w:t>，防止平凡局面拖长；</w:t>
-            </w:r>
-            <w:r>
-              <w:rPr>
-                <w:sz w:val="24"/>
-              </w:rPr>
-              <w:t xml:space="preserve">playout </w:t>
-            </w:r>
-            <w:r>
-              <w:rPr>
-                <w:sz w:val="24"/>
-              </w:rPr>
-              <w:t>阶段调用</w:t>
-            </w:r>
-            <w:r>
-              <w:rPr>
-                <w:sz w:val="24"/>
-              </w:rPr>
-              <w:t xml:space="preserve"> GreedyAI </w:t>
-            </w:r>
-            <w:r>
-              <w:rPr>
-                <w:sz w:val="24"/>
-              </w:rPr>
-              <w:t>作为基础策略，叠加</w:t>
-            </w:r>
-            <w:r>
-              <w:rPr>
-                <w:sz w:val="24"/>
-              </w:rPr>
-              <w:t xml:space="preserve"> ε-greedy </w:t>
-            </w:r>
-            <w:r>
-              <w:rPr>
-                <w:sz w:val="24"/>
-              </w:rPr>
-              <w:t>探索（</w:t>
-            </w:r>
-            <w:r>
-              <w:rPr>
-                <w:sz w:val="24"/>
-              </w:rPr>
-              <w:t>ε = 0.15</w:t>
-            </w:r>
-            <w:r>
-              <w:rPr>
-                <w:sz w:val="24"/>
-              </w:rPr>
-              <w:t>），在贪心收敛与探索覆盖之间取得平衡；</w:t>
-            </w:r>
-            <w:r>
-              <w:rPr>
-                <w:sz w:val="24"/>
-              </w:rPr>
-              <w:t>若所有候选走法在预算内都无法完成至少一次有效模拟，程序退化为</w:t>
-            </w:r>
-            <w:r>
-              <w:rPr>
-                <w:sz w:val="24"/>
-              </w:rPr>
-              <w:t xml:space="preserve"> greedy_risk </w:t>
-            </w:r>
-            <w:r>
-              <w:rPr>
-                <w:sz w:val="24"/>
-              </w:rPr>
-              <w:t>等价的风险感知贪心策略，保证始终输出合法且可解释的走法。</w:t>
+                <w:b/>
+                <w:sz w:val="24"/>
+              </w:rPr>
+              <w:t>3</w:t>
+            </w:r>
+            <w:r>
+              <w:rPr>
+                <w:b/>
+                <w:sz w:val="24"/>
+              </w:rPr>
+              <w:t>．</w:t>
+            </w:r>
+            <w:r>
+              <w:rPr>
+                <w:b/>
+                <w:sz w:val="24"/>
+              </w:rPr>
+              <w:t>MCTSAI</w:t>
+            </w:r>
+            <w:r>
+              <w:rPr>
+                <w:b/>
+                <w:sz w:val="24"/>
+              </w:rPr>
+              <w:t>：显式骰子随机节点的</w:t>
+            </w:r>
+            <w:r>
+              <w:rPr>
+                <w:b/>
+                <w:sz w:val="24"/>
+              </w:rPr>
+              <w:t xml:space="preserve"> UCT </w:t>
+            </w:r>
+            <w:r>
+              <w:rPr>
+                <w:b/>
+                <w:sz w:val="24"/>
+              </w:rPr>
+              <w:t>树搜索（创新点）</w:t>
             </w:r>
           </w:p>
           <w:p>
             <w:pPr>
               <w:spacing w:line="360" w:lineRule="auto"/>
+              <w:ind w:firstLineChars="100" w:firstLine="240"/>
             </w:pPr>
             <w:r>
               <w:rPr>
                 <w:sz w:val="24"/>
               </w:rPr>
-              <w:t>实测数据（</w:t>
-            </w:r>
-            <w:r>
-              <w:rPr>
-                <w:sz w:val="24"/>
-              </w:rPr>
-              <w:t xml:space="preserve">release/v1.0 </w:t>
-            </w:r>
-            <w:r>
-              <w:rPr>
-                <w:sz w:val="24"/>
-              </w:rPr>
-              <w:t>验证集）：与</w:t>
-            </w:r>
-            <w:r>
-              <w:rPr>
-                <w:sz w:val="24"/>
-              </w:rPr>
-              <w:t xml:space="preserve"> greedy_risk </w:t>
-            </w:r>
-            <w:r>
-              <w:rPr>
-                <w:sz w:val="24"/>
-              </w:rPr>
-              <w:t>双边各</w:t>
-            </w:r>
-            <w:r>
-              <w:rPr>
-                <w:sz w:val="24"/>
-              </w:rPr>
-              <w:t xml:space="preserve"> 400 </w:t>
-            </w:r>
-            <w:r>
-              <w:rPr>
-                <w:sz w:val="24"/>
-              </w:rPr>
-              <w:t>局共</w:t>
-            </w:r>
-            <w:r>
-              <w:rPr>
-                <w:sz w:val="24"/>
-              </w:rPr>
-              <w:t xml:space="preserve"> 800 </w:t>
-            </w:r>
-            <w:r>
-              <w:rPr>
-                <w:sz w:val="24"/>
-              </w:rPr>
-              <w:t>局，合并胜率</w:t>
-            </w:r>
-            <w:r>
-              <w:rPr>
-                <w:sz w:val="24"/>
-              </w:rPr>
-              <w:t xml:space="preserve"> 62.62%</w:t>
-            </w:r>
-            <w:r>
-              <w:rPr>
-                <w:sz w:val="24"/>
-              </w:rPr>
-              <w:t>，且</w:t>
-            </w:r>
-            <w:r>
-              <w:rPr>
-                <w:sz w:val="24"/>
-              </w:rPr>
-              <w:t xml:space="preserve"> 0 illegal move</w:t>
-            </w:r>
-            <w:r>
-              <w:rPr>
-                <w:sz w:val="24"/>
-              </w:rPr>
-              <w:t>、</w:t>
-            </w:r>
-            <w:r>
-              <w:rPr>
-                <w:sz w:val="24"/>
-              </w:rPr>
-              <w:t>0 crash</w:t>
-            </w:r>
-            <w:r>
-              <w:rPr>
-                <w:sz w:val="24"/>
-              </w:rPr>
-              <w:t>、</w:t>
-            </w:r>
-            <w:r>
-              <w:rPr>
-                <w:sz w:val="24"/>
-              </w:rPr>
-              <w:t>0 timeout</w:t>
-            </w:r>
-            <w:r>
-              <w:rPr>
-                <w:sz w:val="24"/>
-              </w:rPr>
-              <w:t>。</w:t>
+              <w:t xml:space="preserve">MCTSAI </w:t>
+            </w:r>
+            <w:r>
+              <w:rPr>
+                <w:sz w:val="24"/>
+              </w:rPr>
+              <w:t>作为实验候选保留，是本项目相对于纯随机</w:t>
+            </w:r>
+            <w:r>
+              <w:rPr>
+                <w:sz w:val="24"/>
+              </w:rPr>
+              <w:t>rollout</w:t>
+            </w:r>
+            <w:r>
+              <w:rPr>
+                <w:sz w:val="24"/>
+              </w:rPr>
+              <w:t>的主要算法探索方向。其核心设计是将搜索树节点显式分离为</w:t>
+            </w:r>
+            <w:r>
+              <w:rPr>
+                <w:sz w:val="24"/>
+              </w:rPr>
+              <w:t>DecisionNode</w:t>
+            </w:r>
+            <w:r>
+              <w:rPr>
+                <w:sz w:val="24"/>
+              </w:rPr>
+              <w:t>（决策节点）与</w:t>
+            </w:r>
+            <w:r>
+              <w:rPr>
+                <w:sz w:val="24"/>
+              </w:rPr>
+              <w:t>ChanceNode</w:t>
+            </w:r>
+            <w:r>
+              <w:rPr>
+                <w:sz w:val="24"/>
+              </w:rPr>
+              <w:t>（机会节点）：</w:t>
+            </w:r>
+            <w:r>
+              <w:rPr>
+                <w:sz w:val="24"/>
+              </w:rPr>
+              <w:t>DecisionNode</w:t>
+            </w:r>
+            <w:r>
+              <w:rPr>
+                <w:sz w:val="24"/>
+              </w:rPr>
+              <w:t>表示当前方在已知骰子下从合法走法中选择；</w:t>
+            </w:r>
+            <w:r>
+              <w:rPr>
+                <w:sz w:val="24"/>
+              </w:rPr>
+              <w:t>ChanceNode</w:t>
+            </w:r>
+            <w:r>
+              <w:rPr>
+                <w:sz w:val="24"/>
+              </w:rPr>
+              <w:t>表示骰子尚未掷出的随机分支，按</w:t>
+            </w:r>
+            <w:r>
+              <w:rPr>
+                <w:sz w:val="24"/>
+              </w:rPr>
+              <w:t>1/6</w:t>
+            </w:r>
+            <w:r>
+              <w:rPr>
+                <w:sz w:val="24"/>
+              </w:rPr>
+              <w:t>均匀采样。这一设计避免把骰子随机性误建模为对手决策。</w:t>
+            </w:r>
+            <w:r>
+              <w:rPr>
+                <w:sz w:val="24"/>
+              </w:rPr>
+              <w:t>P4</w:t>
+            </w:r>
+            <w:r>
+              <w:rPr>
+                <w:sz w:val="24"/>
+              </w:rPr>
+              <w:t>阶段进一步修正了</w:t>
+            </w:r>
+            <w:r>
+              <w:rPr>
+                <w:sz w:val="24"/>
+              </w:rPr>
+              <w:t>opponent DecisionNode</w:t>
+            </w:r>
+            <w:r>
+              <w:rPr>
+                <w:sz w:val="24"/>
+              </w:rPr>
+              <w:t>语义：</w:t>
+            </w:r>
+            <w:r>
+              <w:rPr>
+                <w:sz w:val="24"/>
+              </w:rPr>
+              <w:t>root-player</w:t>
+            </w:r>
+            <w:r>
+              <w:rPr>
+                <w:sz w:val="24"/>
+              </w:rPr>
+              <w:t>节点最大化</w:t>
+            </w:r>
+            <w:r>
+              <w:rPr>
+                <w:sz w:val="24"/>
+              </w:rPr>
+              <w:t>root</w:t>
+            </w:r>
+            <w:r>
+              <w:rPr>
+                <w:sz w:val="24"/>
+              </w:rPr>
+              <w:t>视角价值，对手节点最小化</w:t>
+            </w:r>
+            <w:r>
+              <w:rPr>
+                <w:sz w:val="24"/>
+              </w:rPr>
+              <w:t>root</w:t>
+            </w:r>
+            <w:r>
+              <w:rPr>
+                <w:sz w:val="24"/>
+              </w:rPr>
+              <w:t>视角价值，回传始终保持</w:t>
+            </w:r>
+            <w:r>
+              <w:rPr>
+                <w:sz w:val="24"/>
+              </w:rPr>
+              <w:t>root-player</w:t>
+            </w:r>
+            <w:r>
+              <w:rPr>
+                <w:sz w:val="24"/>
+              </w:rPr>
+              <w:t>视角。</w:t>
             </w:r>
           </w:p>
           <w:p>
             <w:pPr>
               <w:spacing w:line="360" w:lineRule="auto"/>
+              <w:ind w:firstLineChars="100" w:firstLine="240"/>
             </w:pPr>
             <w:r>
               <w:rPr>
-                <w:b/>
-                <w:sz w:val="24"/>
-              </w:rPr>
-              <w:t>3</w:t>
-            </w:r>
-            <w:r>
-              <w:rPr>
-                <w:b/>
-                <w:sz w:val="24"/>
-              </w:rPr>
-              <w:t>．</w:t>
-            </w:r>
-            <w:r>
-              <w:rPr>
-                <w:b/>
-                <w:sz w:val="24"/>
-              </w:rPr>
-              <w:t>MCTSAI</w:t>
-            </w:r>
-            <w:r>
-              <w:rPr>
-                <w:b/>
-                <w:sz w:val="24"/>
-              </w:rPr>
-              <w:t>：显式骰子随机节点的</w:t>
-            </w:r>
-            <w:r>
-              <w:rPr>
-                <w:b/>
-                <w:sz w:val="24"/>
-              </w:rPr>
-              <w:t xml:space="preserve"> UCT </w:t>
-            </w:r>
-            <w:r>
-              <w:rPr>
-                <w:b/>
-                <w:sz w:val="24"/>
-              </w:rPr>
-              <w:t>树搜索（创新点）</w:t>
-            </w:r>
-          </w:p>
-          <w:p>
-            <w:pPr>
-              <w:spacing w:line="360" w:lineRule="auto"/>
-            </w:pPr>
-            <w:r>
-              <w:rPr>
-                <w:sz w:val="24"/>
-              </w:rPr>
-              <w:t xml:space="preserve">MCTSAI </w:t>
-            </w:r>
-            <w:r>
-              <w:rPr>
-                <w:sz w:val="24"/>
-              </w:rPr>
-              <w:t>作为</w:t>
-            </w:r>
-            <w:r>
-              <w:rPr>
-                <w:sz w:val="24"/>
-              </w:rPr>
-              <w:t xml:space="preserve"> Phase 1 </w:t>
-            </w:r>
-            <w:r>
-              <w:rPr>
-                <w:sz w:val="24"/>
-              </w:rPr>
-              <w:t>实验候选保留，是本项目相对于纯随机</w:t>
-            </w:r>
-            <w:r>
-              <w:rPr>
-                <w:sz w:val="24"/>
-              </w:rPr>
-              <w:t xml:space="preserve"> rollout </w:t>
-            </w:r>
-            <w:r>
-              <w:rPr>
-                <w:sz w:val="24"/>
-              </w:rPr>
-              <w:t>的主要算法创新方向。其核心设计是将搜索树节点显式分离为两类：</w:t>
-            </w:r>
-            <w:r>
-              <w:rPr>
-                <w:sz w:val="24"/>
-              </w:rPr>
-              <w:t>DecisionNode</w:t>
-            </w:r>
-            <w:r>
-              <w:rPr>
-                <w:sz w:val="24"/>
-              </w:rPr>
-              <w:t>（决策节点）表示当前方在已知骰子下从合法走法中选择，使用</w:t>
-            </w:r>
-            <w:r>
-              <w:rPr>
-                <w:sz w:val="24"/>
-              </w:rPr>
-              <w:t xml:space="preserve"> UCT </w:t>
-            </w:r>
-            <w:r>
-              <w:rPr>
-                <w:sz w:val="24"/>
-              </w:rPr>
-              <w:t>公式选择子节点；</w:t>
-            </w:r>
-            <w:r>
-              <w:rPr>
-                <w:sz w:val="24"/>
-              </w:rPr>
-              <w:t>ChanceNode</w:t>
-            </w:r>
-            <w:r>
-              <w:rPr>
-                <w:sz w:val="24"/>
-              </w:rPr>
-              <w:t>（机会节点）表示骰子尚未掷出的随机分支，不参与</w:t>
-            </w:r>
-            <w:r>
-              <w:rPr>
-                <w:sz w:val="24"/>
-              </w:rPr>
-              <w:t xml:space="preserve"> UCT</w:t>
-            </w:r>
-            <w:r>
-              <w:rPr>
-                <w:sz w:val="24"/>
-              </w:rPr>
-              <w:t>，而按</w:t>
-            </w:r>
-            <w:r>
-              <w:rPr>
-                <w:sz w:val="24"/>
-              </w:rPr>
-              <w:t xml:space="preserve"> 1/6 </w:t>
-            </w:r>
-            <w:r>
-              <w:rPr>
-                <w:sz w:val="24"/>
-              </w:rPr>
-              <w:t>均</w:t>
-            </w:r>
-            <w:r>
-              <w:rPr>
-                <w:sz w:val="24"/>
-              </w:rPr>
-              <w:lastRenderedPageBreak/>
-              <w:t>匀分布采样。这一设计避免了</w:t>
-            </w:r>
-            <w:r>
-              <w:rPr>
-                <w:sz w:val="24"/>
-              </w:rPr>
-              <w:t>“</w:t>
-            </w:r>
-            <w:r>
-              <w:rPr>
-                <w:sz w:val="24"/>
-              </w:rPr>
-              <w:t>把骰子结果当成对手决策</w:t>
-            </w:r>
-            <w:r>
-              <w:rPr>
-                <w:sz w:val="24"/>
-              </w:rPr>
-              <w:t>”</w:t>
-            </w:r>
-            <w:r>
-              <w:rPr>
-                <w:sz w:val="24"/>
-              </w:rPr>
-              <w:t>的常见错误</w:t>
-            </w:r>
-            <w:r>
-              <w:rPr>
-                <w:sz w:val="24"/>
-              </w:rPr>
-              <w:t>——</w:t>
-            </w:r>
-            <w:r>
-              <w:rPr>
-                <w:sz w:val="24"/>
-              </w:rPr>
-              <w:t>后者会让搜索树高估对手的不利掷骰、低估友方的不利掷骰。</w:t>
-            </w:r>
-          </w:p>
-          <w:p>
-            <w:pPr>
-              <w:spacing w:line="360" w:lineRule="auto"/>
-            </w:pPr>
-            <w:r>
-              <w:rPr>
-                <w:sz w:val="24"/>
-              </w:rPr>
-              <w:t>选择策略采用标准</w:t>
-            </w:r>
-            <w:r>
-              <w:rPr>
-                <w:sz w:val="24"/>
-              </w:rPr>
-              <w:t xml:space="preserve"> UCT </w:t>
-            </w:r>
-            <w:r>
-              <w:rPr>
-                <w:sz w:val="24"/>
-              </w:rPr>
-              <w:t>公式，探索常数</w:t>
-            </w:r>
-            <w:r>
-              <w:rPr>
-                <w:sz w:val="24"/>
-              </w:rPr>
-              <w:t xml:space="preserve"> c_UCT = √2</w:t>
-            </w:r>
-            <w:r>
-              <w:rPr>
-                <w:sz w:val="24"/>
-              </w:rPr>
-              <w:t>；叶节点估值使用</w:t>
-            </w:r>
-            <w:r>
-              <w:rPr>
-                <w:sz w:val="24"/>
-              </w:rPr>
-              <w:t xml:space="preserve"> core </w:t>
-            </w:r>
-            <w:r>
-              <w:rPr>
-                <w:sz w:val="24"/>
-              </w:rPr>
-              <w:t>层</w:t>
-            </w:r>
-            <w:r>
-              <w:rPr>
-                <w:sz w:val="24"/>
-              </w:rPr>
-              <w:t xml:space="preserve"> evaluate() </w:t>
-            </w:r>
-            <w:r>
-              <w:rPr>
-                <w:sz w:val="24"/>
-              </w:rPr>
-              <w:t>启发式，再经</w:t>
-            </w:r>
-            <w:r>
-              <w:rPr>
-                <w:sz w:val="24"/>
-              </w:rPr>
-              <w:t xml:space="preserve"> tanh(raw/100) </w:t>
-            </w:r>
-            <w:r>
-              <w:rPr>
-                <w:sz w:val="24"/>
-              </w:rPr>
-              <w:t>归一化到</w:t>
-            </w:r>
-            <w:r>
-              <w:rPr>
-                <w:sz w:val="24"/>
-              </w:rPr>
-              <w:t xml:space="preserve"> [-1, 1] </w:t>
-            </w:r>
-            <w:r>
-              <w:rPr>
-                <w:sz w:val="24"/>
-              </w:rPr>
-              <w:t>区间，避免极端分数主导回传；所有叶值都从</w:t>
-            </w:r>
-            <w:r>
-              <w:rPr>
-                <w:sz w:val="24"/>
-              </w:rPr>
-              <w:t xml:space="preserve"> root_player </w:t>
-            </w:r>
-            <w:r>
-              <w:rPr>
-                <w:sz w:val="24"/>
-              </w:rPr>
-              <w:t>视角统一回传，规避多轮搜索中视角翻转的隐性</w:t>
-            </w:r>
-            <w:r>
-              <w:rPr>
-                <w:sz w:val="24"/>
-              </w:rPr>
-              <w:t xml:space="preserve"> bug</w:t>
-            </w:r>
-            <w:r>
-              <w:rPr>
-                <w:sz w:val="24"/>
-              </w:rPr>
-              <w:t>；时间预算与</w:t>
-            </w:r>
-            <w:r>
-              <w:rPr>
-                <w:sz w:val="24"/>
-              </w:rPr>
-              <w:t xml:space="preserve"> RolloutAI </w:t>
-            </w:r>
-            <w:r>
-              <w:rPr>
-                <w:sz w:val="24"/>
-              </w:rPr>
-              <w:t>一致设为单步</w:t>
-            </w:r>
-            <w:r>
-              <w:rPr>
-                <w:sz w:val="24"/>
-              </w:rPr>
-              <w:t xml:space="preserve"> 500 ms</w:t>
-            </w:r>
-            <w:r>
-              <w:rPr>
-                <w:sz w:val="24"/>
-              </w:rPr>
-              <w:t>，每次</w:t>
-            </w:r>
-            <w:r>
-              <w:rPr>
-                <w:sz w:val="24"/>
-              </w:rPr>
-              <w:t xml:space="preserve"> choose_move </w:t>
-            </w:r>
-            <w:r>
-              <w:rPr>
-                <w:sz w:val="24"/>
-              </w:rPr>
-              <w:t>新建搜索树，不做跨步</w:t>
-            </w:r>
-            <w:r>
-              <w:rPr>
-                <w:sz w:val="24"/>
-              </w:rPr>
-              <w:t xml:space="preserve"> transposition</w:t>
-            </w:r>
-            <w:r>
-              <w:rPr>
-                <w:sz w:val="24"/>
-              </w:rPr>
-              <w:t>，便于隔离评估（</w:t>
-            </w:r>
-            <w:r>
-              <w:rPr>
-                <w:sz w:val="24"/>
-              </w:rPr>
-              <w:t xml:space="preserve">Phase 1 </w:t>
-            </w:r>
-            <w:r>
-              <w:rPr>
-                <w:sz w:val="24"/>
-              </w:rPr>
-              <w:t>实验性约束）。</w:t>
+                <w:sz w:val="24"/>
+              </w:rPr>
+              <w:t>选择策略采用</w:t>
+            </w:r>
+            <w:r>
+              <w:rPr>
+                <w:sz w:val="24"/>
+              </w:rPr>
+              <w:t>UCT</w:t>
+            </w:r>
+            <w:r>
+              <w:rPr>
+                <w:sz w:val="24"/>
+              </w:rPr>
+              <w:t>思想，叶节点估值支持</w:t>
+            </w:r>
+            <w:r>
+              <w:rPr>
+                <w:sz w:val="24"/>
+              </w:rPr>
+              <w:t>current</w:t>
+            </w:r>
+            <w:r>
+              <w:rPr>
+                <w:sz w:val="24"/>
+              </w:rPr>
+              <w:t>与</w:t>
+            </w:r>
+            <w:r>
+              <w:rPr>
+                <w:sz w:val="24"/>
+              </w:rPr>
+              <w:t>zweistein</w:t>
+            </w:r>
+            <w:r>
+              <w:rPr>
+                <w:sz w:val="24"/>
+              </w:rPr>
+              <w:t>两种评估器，并通过统一视角回传规避多轮搜索中的视角翻转问题。</w:t>
+            </w:r>
+            <w:r>
+              <w:rPr>
+                <w:sz w:val="24"/>
+              </w:rPr>
+              <w:t>P4.1 targeted fix</w:t>
+            </w:r>
+            <w:r>
+              <w:rPr>
+                <w:sz w:val="24"/>
+              </w:rPr>
+              <w:t>后，</w:t>
+            </w:r>
+            <w:r>
+              <w:rPr>
+                <w:sz w:val="24"/>
+              </w:rPr>
+              <w:t>mcts_eval_v1(leaf_evaluator=zweistein)</w:t>
+            </w:r>
+            <w:r>
+              <w:rPr>
+                <w:sz w:val="24"/>
+              </w:rPr>
+              <w:t>对当前</w:t>
+            </w:r>
+            <w:r>
+              <w:rPr>
+                <w:sz w:val="24"/>
+              </w:rPr>
+              <w:t>release</w:t>
+            </w:r>
+            <w:r>
+              <w:rPr>
+                <w:sz w:val="24"/>
+              </w:rPr>
+              <w:t>默认</w:t>
+            </w:r>
+            <w:r>
+              <w:rPr>
+                <w:sz w:val="24"/>
+              </w:rPr>
+              <w:t>rollout</w:t>
+            </w:r>
+            <w:r>
+              <w:rPr>
+                <w:sz w:val="24"/>
+              </w:rPr>
+              <w:t>配置进行小样本</w:t>
+            </w:r>
+            <w:r>
+              <w:rPr>
+                <w:sz w:val="24"/>
+              </w:rPr>
+              <w:t>probe</w:t>
+            </w:r>
+            <w:r>
+              <w:rPr>
+                <w:sz w:val="24"/>
+              </w:rPr>
+              <w:t>，双边</w:t>
+            </w:r>
+            <w:r>
+              <w:rPr>
+                <w:sz w:val="24"/>
+              </w:rPr>
+              <w:t>10+10</w:t>
+            </w:r>
+            <w:r>
+              <w:rPr>
+                <w:sz w:val="24"/>
+              </w:rPr>
+              <w:t>共</w:t>
+            </w:r>
+            <w:r>
+              <w:rPr>
+                <w:sz w:val="24"/>
+              </w:rPr>
+              <w:t>20</w:t>
+            </w:r>
+            <w:r>
+              <w:rPr>
+                <w:sz w:val="24"/>
+              </w:rPr>
+              <w:t>局合并胜率</w:t>
+            </w:r>
+            <w:r>
+              <w:rPr>
+                <w:sz w:val="24"/>
+              </w:rPr>
+              <w:t>25.0%</w:t>
+            </w:r>
+            <w:r>
+              <w:rPr>
+                <w:sz w:val="24"/>
+              </w:rPr>
+              <w:t>，</w:t>
+            </w:r>
+            <w:r>
+              <w:rPr>
+                <w:sz w:val="24"/>
+              </w:rPr>
+              <w:t>0 illegal</w:t>
+            </w:r>
+            <w:r>
+              <w:rPr>
+                <w:sz w:val="24"/>
+              </w:rPr>
+              <w:t>、</w:t>
+            </w:r>
+            <w:r>
+              <w:rPr>
+                <w:sz w:val="24"/>
+              </w:rPr>
+              <w:t>0 crash</w:t>
+            </w:r>
+            <w:r>
+              <w:rPr>
+                <w:sz w:val="24"/>
+              </w:rPr>
+              <w:t>、</w:t>
+            </w:r>
+            <w:r>
+              <w:rPr>
+                <w:sz w:val="24"/>
+              </w:rPr>
+              <w:t>0 timeout</w:t>
+            </w:r>
+            <w:r>
+              <w:rPr>
+                <w:sz w:val="24"/>
+              </w:rPr>
+              <w:t>，低于</w:t>
+            </w:r>
+            <w:r>
+              <w:rPr>
+                <w:sz w:val="24"/>
+              </w:rPr>
+              <w:t>45%</w:t>
+            </w:r>
+            <w:r>
+              <w:rPr>
+                <w:sz w:val="24"/>
+              </w:rPr>
+              <w:t>停止线。</w:t>
             </w:r>
           </w:p>
           <w:p>
@@ -2752,9 +3128,6 @@
               <w:jc w:val="center"/>
             </w:pPr>
             <w:r>
-              <w:rPr>
-                <w:noProof/>
-              </w:rPr>
               <w:drawing>
                 <wp:inline distT="0" distB="0" distL="0" distR="0" wp14:anchorId="74228B2F" wp14:editId="6C428CD2">
                   <wp:extent cx="5040000" cy="2836507"/>
@@ -2908,7 +3281,14 @@
               <w:rPr>
                 <w:sz w:val="24"/>
               </w:rPr>
-              <w:t>两类确定性走法从概率搜索中剥离出来，提升到硬规则层。</w:t>
+              <w:t>两类确定性走</w:t>
+            </w:r>
+            <w:r>
+              <w:rPr>
+                <w:sz w:val="24"/>
+              </w:rPr>
+              <w:lastRenderedPageBreak/>
+              <w:t>法从概率搜索中剥离出来，提升到硬规则层。</w:t>
             </w:r>
             <w:r>
               <w:rPr>
@@ -3176,14 +3556,7 @@
               <w:rPr>
                 <w:sz w:val="24"/>
               </w:rPr>
-              <w:t xml:space="preserve"> </w:t>
-            </w:r>
-            <w:r>
-              <w:rPr>
-                <w:sz w:val="24"/>
-              </w:rPr>
-              <w:lastRenderedPageBreak/>
-              <w:t>winning_dice_set</w:t>
+              <w:t xml:space="preserve"> winning_dice_set</w:t>
             </w:r>
             <w:r>
               <w:rPr>
@@ -3449,9 +3822,7 @@
               <w:jc w:val="center"/>
             </w:pPr>
             <w:r>
-              <w:rPr>
-                <w:noProof/>
-              </w:rPr>
+              <w:lastRenderedPageBreak/>
               <w:drawing>
                 <wp:inline distT="0" distB="0" distL="0" distR="0" wp14:anchorId="50215324" wp14:editId="3E5B4FF1">
                   <wp:extent cx="5039165" cy="5571461"/>
@@ -3532,7 +3903,148 @@
                 <w:b/>
                 <w:sz w:val="24"/>
               </w:rPr>
-              <w:t>．多目标线性加权评估函数</w:t>
+              <w:t>．</w:t>
+            </w:r>
+            <w:r>
+              <w:rPr>
+                <w:b/>
+                <w:sz w:val="24"/>
+              </w:rPr>
+              <w:t>多目标线性评估函数与</w:t>
+            </w:r>
+            <w:r>
+              <w:rPr>
+                <w:b/>
+                <w:sz w:val="24"/>
+              </w:rPr>
+              <w:t>Zweistein-lite</w:t>
+            </w:r>
+            <w:r>
+              <w:rPr>
+                <w:b/>
+                <w:sz w:val="24"/>
+              </w:rPr>
+              <w:t>叶节点估值</w:t>
+            </w:r>
+          </w:p>
+          <w:p>
+            <w:pPr>
+              <w:spacing w:line="360" w:lineRule="auto"/>
+              <w:ind w:firstLineChars="100" w:firstLine="240"/>
+            </w:pPr>
+            <w:r>
+              <w:rPr>
+                <w:sz w:val="24"/>
+              </w:rPr>
+              <w:t>基础评估函数保留距离、子力、期望被吃风险、期望一步胜风险和主动吃本方棋子的机动性收益等特征，终局</w:t>
+            </w:r>
+            <w:r>
+              <w:rPr>
+                <w:sz w:val="24"/>
+              </w:rPr>
+              <w:t>WIN_SCORE = 1,000,000</w:t>
+            </w:r>
+            <w:r>
+              <w:rPr>
+                <w:sz w:val="24"/>
+              </w:rPr>
+              <w:t>。其中</w:t>
+            </w:r>
+            <w:r>
+              <w:rPr>
+                <w:sz w:val="24"/>
+              </w:rPr>
+              <w:t>expected_risk</w:t>
+            </w:r>
+            <w:r>
+              <w:rPr>
+                <w:sz w:val="24"/>
+              </w:rPr>
+              <w:t>按距离衰减聚合对手下一轮</w:t>
+            </w:r>
+            <w:r>
+              <w:rPr>
+                <w:sz w:val="24"/>
+              </w:rPr>
+              <w:t>6</w:t>
+            </w:r>
+            <w:r>
+              <w:rPr>
+                <w:sz w:val="24"/>
+              </w:rPr>
+              <w:t>个骰子下的吃子威胁，</w:t>
+            </w:r>
+            <w:r>
+              <w:rPr>
+                <w:sz w:val="24"/>
+              </w:rPr>
+              <w:t>expected_win_risk</w:t>
+            </w:r>
+            <w:r>
+              <w:rPr>
+                <w:sz w:val="24"/>
+              </w:rPr>
+              <w:t>专项跟踪对手一步胜威胁。</w:t>
+            </w:r>
+            <w:r>
+              <w:rPr>
+                <w:sz w:val="24"/>
+              </w:rPr>
+              <w:t>P3</w:t>
+            </w:r>
+            <w:r>
+              <w:rPr>
+                <w:sz w:val="24"/>
+              </w:rPr>
+              <w:t>新增</w:t>
+            </w:r>
+            <w:r>
+              <w:rPr>
+                <w:sz w:val="24"/>
+              </w:rPr>
+              <w:t>Zweistein-lite</w:t>
+            </w:r>
+            <w:r>
+              <w:rPr>
+                <w:sz w:val="24"/>
+              </w:rPr>
+              <w:t>评估器，在推进、子力、期望机动性、被吃风险和直接到角风险之间做轻量加权，用于</w:t>
+            </w:r>
+            <w:r>
+              <w:rPr>
+                <w:sz w:val="24"/>
+              </w:rPr>
+              <w:t>RolloutAI cutoff_eval</w:t>
+            </w:r>
+            <w:r>
+              <w:rPr>
+                <w:sz w:val="24"/>
+              </w:rPr>
+              <w:t>和部分</w:t>
+            </w:r>
+            <w:r>
+              <w:rPr>
+                <w:sz w:val="24"/>
+              </w:rPr>
+              <w:t>Expectimax/MCTS</w:t>
+            </w:r>
+            <w:r>
+              <w:rPr>
+                <w:sz w:val="24"/>
+              </w:rPr>
+              <w:t>实验，不改变</w:t>
+            </w:r>
+            <w:r>
+              <w:rPr>
+                <w:sz w:val="24"/>
+              </w:rPr>
+              <w:t>core</w:t>
+            </w:r>
+            <w:r>
+              <w:rPr>
+                <w:sz w:val="24"/>
+              </w:rPr>
+              <w:t>规则语义。</w:t>
             </w:r>
           </w:p>
           <w:p>
@@ -3541,100 +4053,315 @@
             </w:pPr>
             <w:r>
               <w:rPr>
-                <w:sz w:val="24"/>
-              </w:rPr>
-              <w:t xml:space="preserve">ai/evaluator.py </w:t>
-            </w:r>
-            <w:r>
-              <w:rPr>
-                <w:sz w:val="24"/>
-              </w:rPr>
-              <w:t>综合</w:t>
-            </w:r>
-            <w:r>
-              <w:rPr>
-                <w:sz w:val="24"/>
-              </w:rPr>
-              <w:t xml:space="preserve"> 5 </w:t>
-            </w:r>
-            <w:r>
-              <w:rPr>
-                <w:sz w:val="24"/>
-              </w:rPr>
-              <w:t>个因子线性加权得到</w:t>
-            </w:r>
-            <w:r>
-              <w:rPr>
-                <w:sz w:val="24"/>
-              </w:rPr>
-              <w:t xml:space="preserve"> score</w:t>
-            </w:r>
-            <w:r>
-              <w:rPr>
-                <w:sz w:val="24"/>
-              </w:rPr>
-              <w:t>：</w:t>
+                <w:b/>
+                <w:sz w:val="24"/>
+              </w:rPr>
+              <w:t>6</w:t>
+            </w:r>
+            <w:r>
+              <w:rPr>
+                <w:b/>
+                <w:sz w:val="24"/>
+              </w:rPr>
+              <w:t>．</w:t>
+            </w:r>
+            <w:r>
+              <w:rPr>
+                <w:b/>
+                <w:sz w:val="24"/>
+              </w:rPr>
+              <w:t>三阶段门禁验证流程与</w:t>
+            </w:r>
+            <w:r>
+              <w:rPr>
+                <w:b/>
+                <w:sz w:val="24"/>
+              </w:rPr>
+              <w:t>P5</w:t>
+            </w:r>
+            <w:r>
+              <w:rPr>
+                <w:b/>
+                <w:sz w:val="24"/>
+              </w:rPr>
+              <w:t>开局搜索结论</w:t>
             </w:r>
           </w:p>
           <w:p>
             <w:pPr>
               <w:spacing w:line="360" w:lineRule="auto"/>
-              <w:ind w:left="454"/>
+              <w:ind w:firstLineChars="100" w:firstLine="240"/>
             </w:pPr>
             <w:r>
               <w:rPr>
-                <w:rFonts w:ascii="Consolas" w:eastAsia="Consolas" w:hAnsi="Consolas"/>
+                <w:sz w:val="24"/>
+              </w:rPr>
+              <w:t>为防止过拟合到小样本噪声，每个</w:t>
+            </w:r>
+            <w:r>
+              <w:rPr>
+                <w:sz w:val="24"/>
+              </w:rPr>
+              <w:t>AI</w:t>
+            </w:r>
+            <w:r>
+              <w:rPr>
+                <w:sz w:val="24"/>
+              </w:rPr>
+              <w:t>或布局候选必须经过</w:t>
+            </w:r>
+            <w:r>
+              <w:rPr>
+                <w:sz w:val="24"/>
+              </w:rPr>
+              <w:t>smoke</w:t>
+            </w:r>
+            <w:r>
+              <w:rPr>
+                <w:sz w:val="24"/>
+              </w:rPr>
+              <w:t>、</w:t>
+            </w:r>
+            <w:r>
+              <w:rPr>
+                <w:sz w:val="24"/>
+              </w:rPr>
+              <w:t>candidate</w:t>
+            </w:r>
+            <w:r>
+              <w:rPr>
+                <w:sz w:val="24"/>
+              </w:rPr>
+              <w:t>、</w:t>
+            </w:r>
+            <w:r>
+              <w:rPr>
+                <w:sz w:val="24"/>
               </w:rPr>
               <w:lastRenderedPageBreak/>
-              <w:t>score = w_d  · (opp_dist - own_dist)         // 距离差</w:t>
-            </w:r>
-          </w:p>
-          <w:p>
-            <w:pPr>
-              <w:spacing w:line="360" w:lineRule="auto"/>
-              <w:ind w:left="454"/>
-            </w:pPr>
-            <w:r>
-              <w:rPr>
-                <w:rFonts w:ascii="Consolas" w:eastAsia="Consolas" w:hAnsi="Consolas"/>
-              </w:rPr>
-              <w:t xml:space="preserve">      + w_m  · (own_alive - opp_alive)        // 子力差</w:t>
-            </w:r>
-          </w:p>
-          <w:p>
-            <w:pPr>
-              <w:spacing w:line="360" w:lineRule="auto"/>
-              <w:ind w:left="454"/>
-            </w:pPr>
-            <w:r>
-              <w:rPr>
-                <w:rFonts w:ascii="Consolas" w:eastAsia="Consolas" w:hAnsi="Consolas"/>
-              </w:rPr>
-              <w:t xml:space="preserve">      − w_r  · own_expected_risk              // 期望被吃风险</w:t>
-            </w:r>
-          </w:p>
-          <w:p>
-            <w:pPr>
-              <w:spacing w:line="360" w:lineRule="auto"/>
-              <w:ind w:left="454"/>
-            </w:pPr>
-            <w:r>
-              <w:rPr>
-                <w:rFonts w:ascii="Consolas" w:eastAsia="Consolas" w:hAnsi="Consolas"/>
-              </w:rPr>
-              <w:t xml:space="preserve">      − w_wr · own_expected_win_risk          // 期望被一步胜风险</w:t>
-            </w:r>
-          </w:p>
-          <w:p>
-            <w:pPr>
-              <w:spacing w:line="360" w:lineRule="auto"/>
-              <w:ind w:left="454"/>
-            </w:pPr>
-            <w:r>
-              <w:rPr>
-                <w:rFonts w:ascii="Consolas" w:eastAsia="Consolas" w:hAnsi="Consolas"/>
-              </w:rPr>
-              <w:t xml:space="preserve">      + w_sc · self_capture_gain              // 主动吃自己棋子收益</w:t>
+              <w:t>promotion</w:t>
+            </w:r>
+            <w:r>
+              <w:rPr>
+                <w:sz w:val="24"/>
+              </w:rPr>
+              <w:t>等分层验证，并同时检查</w:t>
+            </w:r>
+            <w:r>
+              <w:rPr>
+                <w:sz w:val="24"/>
+              </w:rPr>
+              <w:t>illegal move</w:t>
+            </w:r>
+            <w:r>
+              <w:rPr>
+                <w:sz w:val="24"/>
+              </w:rPr>
+              <w:t>、</w:t>
+            </w:r>
+            <w:r>
+              <w:rPr>
+                <w:sz w:val="24"/>
+              </w:rPr>
+              <w:t>crash</w:t>
+            </w:r>
+            <w:r>
+              <w:rPr>
+                <w:sz w:val="24"/>
+              </w:rPr>
+              <w:t>、</w:t>
+            </w:r>
+            <w:r>
+              <w:rPr>
+                <w:sz w:val="24"/>
+              </w:rPr>
+              <w:t>timeout</w:t>
+            </w:r>
+            <w:r>
+              <w:rPr>
+                <w:sz w:val="24"/>
+              </w:rPr>
+              <w:t>、平均步时、最大步时和</w:t>
+            </w:r>
+            <w:r>
+              <w:rPr>
+                <w:sz w:val="24"/>
+              </w:rPr>
+              <w:t>Wilson</w:t>
+            </w:r>
+            <w:r>
+              <w:rPr>
+                <w:sz w:val="24"/>
+              </w:rPr>
+              <w:t>置信区间。</w:t>
+            </w:r>
+            <w:r>
+              <w:rPr>
+                <w:sz w:val="24"/>
+              </w:rPr>
+              <w:t>P5</w:t>
+            </w:r>
+            <w:r>
+              <w:rPr>
+                <w:sz w:val="24"/>
+              </w:rPr>
+              <w:t>阶段已完成开局搜索入口守卫、分层候选、</w:t>
+            </w:r>
+            <w:r>
+              <w:rPr>
+                <w:sz w:val="24"/>
+              </w:rPr>
+              <w:t>seed pool</w:t>
+            </w:r>
+            <w:r>
+              <w:rPr>
+                <w:sz w:val="24"/>
+              </w:rPr>
+              <w:t>、</w:t>
+            </w:r>
+            <w:r>
+              <w:rPr>
+                <w:sz w:val="24"/>
+              </w:rPr>
+              <w:t>validation</w:t>
+            </w:r>
+            <w:r>
+              <w:rPr>
+                <w:sz w:val="24"/>
+              </w:rPr>
+              <w:t>扩样和候选布局对默认布局的双边前置验证。最终最有希望的</w:t>
+            </w:r>
+            <w:r>
+              <w:rPr>
+                <w:sz w:val="24"/>
+              </w:rPr>
+              <w:t>balanced</w:t>
+            </w:r>
+            <w:r>
+              <w:rPr>
+                <w:sz w:val="24"/>
+              </w:rPr>
+              <w:t>候选在</w:t>
+            </w:r>
+            <w:r>
+              <w:rPr>
+                <w:sz w:val="24"/>
+              </w:rPr>
+              <w:t>P5.4</w:t>
+            </w:r>
+            <w:r>
+              <w:rPr>
+                <w:sz w:val="24"/>
+              </w:rPr>
+              <w:t>小样本中对</w:t>
+            </w:r>
+            <w:r>
+              <w:rPr>
+                <w:sz w:val="24"/>
+              </w:rPr>
+              <w:t>balanced_v1</w:t>
+            </w:r>
+            <w:r>
+              <w:rPr>
+                <w:sz w:val="24"/>
+              </w:rPr>
+              <w:t>取得</w:t>
+            </w:r>
+            <w:r>
+              <w:rPr>
+                <w:sz w:val="24"/>
+              </w:rPr>
+              <w:t>14/24=58.3%</w:t>
+            </w:r>
+            <w:r>
+              <w:rPr>
+                <w:sz w:val="24"/>
+              </w:rPr>
+              <w:t>，但</w:t>
+            </w:r>
+            <w:r>
+              <w:rPr>
+                <w:sz w:val="24"/>
+              </w:rPr>
+              <w:t>P5.5</w:t>
+            </w:r>
+            <w:r>
+              <w:rPr>
+                <w:sz w:val="24"/>
+              </w:rPr>
+              <w:t>扩到</w:t>
+            </w:r>
+            <w:r>
+              <w:rPr>
+                <w:sz w:val="24"/>
+              </w:rPr>
+              <w:t>60</w:t>
+            </w:r>
+            <w:r>
+              <w:rPr>
+                <w:sz w:val="24"/>
+              </w:rPr>
+              <w:t>局后跌至</w:t>
+            </w:r>
+            <w:r>
+              <w:rPr>
+                <w:sz w:val="24"/>
+              </w:rPr>
+              <w:t>23/60=38.3%</w:t>
+            </w:r>
+            <w:r>
+              <w:rPr>
+                <w:sz w:val="24"/>
+              </w:rPr>
+              <w:t>，</w:t>
+            </w:r>
+            <w:r>
+              <w:rPr>
+                <w:sz w:val="24"/>
+              </w:rPr>
+              <w:t>Wilson</w:t>
+            </w:r>
+            <w:r>
+              <w:rPr>
+                <w:sz w:val="24"/>
+              </w:rPr>
+              <w:t>区间</w:t>
+            </w:r>
+            <w:r>
+              <w:rPr>
+                <w:sz w:val="24"/>
+              </w:rPr>
+              <w:t>[27.1%, 51.0%]</w:t>
+            </w:r>
+            <w:r>
+              <w:rPr>
+                <w:sz w:val="24"/>
+              </w:rPr>
+              <w:t>，因此停止该候选晋升路线。当前</w:t>
+            </w:r>
+            <w:r>
+              <w:rPr>
+                <w:sz w:val="24"/>
+              </w:rPr>
+              <w:t>GUI/release</w:t>
+            </w:r>
+            <w:r>
+              <w:rPr>
+                <w:sz w:val="24"/>
+              </w:rPr>
+              <w:t>默认布局仍保持</w:t>
+            </w:r>
+            <w:r>
+              <w:rPr>
+                <w:sz w:val="24"/>
+              </w:rPr>
+              <w:t>balanced_v1</w:t>
+            </w:r>
+            <w:r>
+              <w:rPr>
+                <w:sz w:val="24"/>
+              </w:rPr>
+              <w:t>，未因开局搜索结果进行替换。</w:t>
             </w:r>
           </w:p>
           <w:p>
@@ -3643,105 +4370,17 @@
             </w:pPr>
             <w:r>
               <w:rPr>
-                <w:sz w:val="24"/>
-              </w:rPr>
-              <w:t>参数：</w:t>
-            </w:r>
-            <w:r>
-              <w:rPr>
-                <w:sz w:val="24"/>
-              </w:rPr>
-              <w:t>w_d = 1.0</w:t>
-            </w:r>
-            <w:r>
-              <w:rPr>
-                <w:sz w:val="24"/>
-              </w:rPr>
-              <w:t>，</w:t>
-            </w:r>
-            <w:r>
-              <w:rPr>
-                <w:sz w:val="24"/>
-              </w:rPr>
-              <w:t>w_m = 10.0</w:t>
-            </w:r>
-            <w:r>
-              <w:rPr>
-                <w:sz w:val="24"/>
-              </w:rPr>
-              <w:t>，</w:t>
-            </w:r>
-            <w:r>
-              <w:rPr>
-                <w:sz w:val="24"/>
-              </w:rPr>
-              <w:t>w_r = 3.0</w:t>
-            </w:r>
-            <w:r>
-              <w:rPr>
-                <w:sz w:val="24"/>
-              </w:rPr>
-              <w:t>（候选），</w:t>
-            </w:r>
-            <w:r>
-              <w:rPr>
-                <w:sz w:val="24"/>
-              </w:rPr>
-              <w:t>w_wr = 500.0</w:t>
-            </w:r>
-            <w:r>
-              <w:rPr>
-                <w:sz w:val="24"/>
-              </w:rPr>
-              <w:t>（候选），终局</w:t>
-            </w:r>
-            <w:r>
-              <w:rPr>
-                <w:sz w:val="24"/>
-              </w:rPr>
-              <w:t xml:space="preserve"> WIN_SCORE = 1,000,000</w:t>
-            </w:r>
-            <w:r>
-              <w:rPr>
-                <w:sz w:val="24"/>
-              </w:rPr>
-              <w:t>。其中</w:t>
-            </w:r>
-            <w:r>
-              <w:rPr>
-                <w:sz w:val="24"/>
-              </w:rPr>
-              <w:t xml:space="preserve"> expected_risk </w:t>
-            </w:r>
-            <w:r>
-              <w:rPr>
-                <w:sz w:val="24"/>
-              </w:rPr>
-              <w:t>按距离衰减聚合对手下一轮</w:t>
-            </w:r>
-            <w:r>
-              <w:rPr>
-                <w:sz w:val="24"/>
-              </w:rPr>
-              <w:t xml:space="preserve"> 6 </w:t>
-            </w:r>
-            <w:r>
-              <w:rPr>
-                <w:sz w:val="24"/>
-              </w:rPr>
-              <w:t>个骰子下的吃子威胁，</w:t>
-            </w:r>
-            <w:r>
-              <w:rPr>
-                <w:sz w:val="24"/>
-              </w:rPr>
-              <w:t xml:space="preserve">expected_win_risk </w:t>
-            </w:r>
-            <w:r>
-              <w:rPr>
-                <w:sz w:val="24"/>
-              </w:rPr>
-              <w:t>专项跟踪对手一步胜威胁，权重显著高于一般吃子。</w:t>
+                <w:b/>
+                <w:sz w:val="24"/>
+              </w:rPr>
+              <w:t>7</w:t>
+            </w:r>
+            <w:r>
+              <w:rPr>
+                <w:b/>
+                <w:sz w:val="24"/>
+              </w:rPr>
+              <w:t>．对战引擎与异常约定</w:t>
             </w:r>
           </w:p>
           <w:p>
@@ -3750,17 +4389,63 @@
             </w:pPr>
             <w:r>
               <w:rPr>
-                <w:b/>
-                <w:sz w:val="24"/>
-              </w:rPr>
-              <w:t>6</w:t>
-            </w:r>
-            <w:r>
-              <w:rPr>
-                <w:b/>
-                <w:sz w:val="24"/>
-              </w:rPr>
-              <w:t>．三阶段门禁验证流程</w:t>
+                <w:sz w:val="24"/>
+              </w:rPr>
+              <w:t xml:space="preserve">ai/match.py </w:t>
+            </w:r>
+            <w:r>
+              <w:rPr>
+                <w:sz w:val="24"/>
+              </w:rPr>
+              <w:t>实现完整七盘制对战与状态回放，并明确异常约定：</w:t>
+            </w:r>
+            <w:r>
+              <w:rPr>
+                <w:sz w:val="24"/>
+              </w:rPr>
+              <w:t xml:space="preserve">AI </w:t>
+            </w:r>
+            <w:r>
+              <w:rPr>
+                <w:sz w:val="24"/>
+              </w:rPr>
+              <w:t>抛出未处理异常判负（</w:t>
+            </w:r>
+            <w:r>
+              <w:rPr>
+                <w:sz w:val="24"/>
+              </w:rPr>
+              <w:t>crash loss</w:t>
+            </w:r>
+            <w:r>
+              <w:rPr>
+                <w:sz w:val="24"/>
+              </w:rPr>
+              <w:t>），走法不在当前合法集合判负（</w:t>
+            </w:r>
+            <w:r>
+              <w:rPr>
+                <w:sz w:val="24"/>
+              </w:rPr>
+              <w:t>illegal loss</w:t>
+            </w:r>
+            <w:r>
+              <w:rPr>
+                <w:sz w:val="24"/>
+              </w:rPr>
+              <w:t>），单步超过时限判负（</w:t>
+            </w:r>
+            <w:r>
+              <w:rPr>
+                <w:sz w:val="24"/>
+              </w:rPr>
+              <w:t>timeout loss</w:t>
+            </w:r>
+            <w:r>
+              <w:rPr>
+                <w:sz w:val="24"/>
+              </w:rPr>
+              <w:t>）。完整状态序列化支持回放与现场答辩。</w:t>
             </w:r>
           </w:p>
           <w:p>
@@ -3769,516 +4454,184 @@
             </w:pPr>
             <w:r>
               <w:rPr>
-                <w:sz w:val="24"/>
-              </w:rPr>
-              <w:t>为防止过拟合到小样本噪声，每个</w:t>
-            </w:r>
-            <w:r>
-              <w:rPr>
-                <w:sz w:val="24"/>
-              </w:rPr>
-              <w:t xml:space="preserve"> AI </w:t>
-            </w:r>
-            <w:r>
-              <w:rPr>
-                <w:sz w:val="24"/>
-              </w:rPr>
-              <w:t>候选必须依次通过三道门禁：</w:t>
-            </w:r>
-            <w:r>
-              <w:rPr>
-                <w:sz w:val="24"/>
-              </w:rPr>
-              <w:t xml:space="preserve">smoke </w:t>
-            </w:r>
-            <w:r>
-              <w:rPr>
-                <w:sz w:val="24"/>
-              </w:rPr>
-              <w:t>用少量样本快速验证可运行性（无</w:t>
-            </w:r>
-            <w:r>
-              <w:rPr>
-                <w:sz w:val="24"/>
-              </w:rPr>
-              <w:t xml:space="preserve"> illegal</w:t>
-            </w:r>
-            <w:r>
-              <w:rPr>
-                <w:sz w:val="24"/>
-              </w:rPr>
-              <w:t>、无</w:t>
-            </w:r>
-            <w:r>
-              <w:rPr>
-                <w:sz w:val="24"/>
-              </w:rPr>
-              <w:t xml:space="preserve"> crash</w:t>
-            </w:r>
-            <w:r>
-              <w:rPr>
-                <w:sz w:val="24"/>
-              </w:rPr>
-              <w:t>、无超时）；</w:t>
-            </w:r>
-            <w:r>
-              <w:rPr>
-                <w:sz w:val="24"/>
-              </w:rPr>
-              <w:t xml:space="preserve">candidate </w:t>
-            </w:r>
-            <w:r>
-              <w:rPr>
-                <w:sz w:val="24"/>
-              </w:rPr>
-              <w:t>用中等样本做统计学验证（含双边交换、置信区间）；</w:t>
-            </w:r>
-            <w:r>
-              <w:rPr>
-                <w:sz w:val="24"/>
-              </w:rPr>
-              <w:t xml:space="preserve">promotion </w:t>
-            </w:r>
-            <w:r>
-              <w:rPr>
-                <w:sz w:val="24"/>
-              </w:rPr>
-              <w:t>用大样本最终验证才能晋升为</w:t>
-            </w:r>
-            <w:r>
-              <w:rPr>
-                <w:sz w:val="24"/>
-              </w:rPr>
-              <w:t xml:space="preserve"> release </w:t>
-            </w:r>
-            <w:r>
-              <w:rPr>
-                <w:sz w:val="24"/>
-              </w:rPr>
-              <w:t>默认。</w:t>
-            </w:r>
-            <w:r>
-              <w:rPr>
-                <w:sz w:val="24"/>
-              </w:rPr>
-              <w:t>截至</w:t>
-            </w:r>
-            <w:r>
-              <w:rPr>
-                <w:sz w:val="24"/>
-              </w:rPr>
-              <w:t xml:space="preserve"> release/v1.0</w:t>
-            </w:r>
-            <w:r>
-              <w:rPr>
-                <w:sz w:val="24"/>
-              </w:rPr>
-              <w:t>，</w:t>
-            </w:r>
-            <w:r>
-              <w:rPr>
-                <w:sz w:val="24"/>
-              </w:rPr>
-              <w:t xml:space="preserve">RolloutAI </w:t>
-            </w:r>
-            <w:r>
-              <w:rPr>
-                <w:sz w:val="24"/>
-              </w:rPr>
-              <w:t>已通过</w:t>
-            </w:r>
-            <w:r>
-              <w:rPr>
-                <w:sz w:val="24"/>
-              </w:rPr>
-              <w:t xml:space="preserve"> promotion </w:t>
-            </w:r>
-            <w:r>
-              <w:rPr>
-                <w:sz w:val="24"/>
-              </w:rPr>
-              <w:t>门禁并晋升为默认</w:t>
-            </w:r>
-            <w:r>
-              <w:rPr>
-                <w:sz w:val="24"/>
-              </w:rPr>
-              <w:t xml:space="preserve"> AI</w:t>
-            </w:r>
-            <w:r>
-              <w:rPr>
-                <w:sz w:val="24"/>
-              </w:rPr>
-              <w:t>；</w:t>
-            </w:r>
-            <w:r>
-              <w:rPr>
-                <w:sz w:val="24"/>
-              </w:rPr>
-              <w:t xml:space="preserve">mcts_eval_v1 </w:t>
-            </w:r>
-            <w:r>
-              <w:rPr>
-                <w:sz w:val="24"/>
-              </w:rPr>
-              <w:t>与</w:t>
-            </w:r>
-            <w:r>
-              <w:rPr>
-                <w:sz w:val="24"/>
-              </w:rPr>
-              <w:t xml:space="preserve"> rollout_tactical </w:t>
-            </w:r>
-            <w:r>
-              <w:rPr>
-                <w:sz w:val="24"/>
-              </w:rPr>
-              <w:t>已完成</w:t>
-            </w:r>
-            <w:r>
-              <w:rPr>
-                <w:sz w:val="24"/>
-              </w:rPr>
-              <w:t xml:space="preserve"> candidate </w:t>
-            </w:r>
-            <w:r>
-              <w:rPr>
-                <w:sz w:val="24"/>
-              </w:rPr>
-              <w:t>评测但未通过门禁，均未替换默认策略。默认</w:t>
-            </w:r>
-            <w:r>
-              <w:rPr>
-                <w:sz w:val="24"/>
-              </w:rPr>
-              <w:t xml:space="preserve"> AI </w:t>
-            </w:r>
-            <w:r>
-              <w:rPr>
-                <w:sz w:val="24"/>
-              </w:rPr>
-              <w:t>变更只依据双边对战、</w:t>
-            </w:r>
-            <w:r>
-              <w:rPr>
-                <w:sz w:val="24"/>
-              </w:rPr>
-              <w:t xml:space="preserve">Wilson </w:t>
-            </w:r>
-            <w:r>
-              <w:rPr>
-                <w:sz w:val="24"/>
-              </w:rPr>
-              <w:t>置信区间、非法走法、崩溃、超时和单步耗时等指标综合判断，不因单局胜负临时调整。</w:t>
+                <w:b/>
+                <w:sz w:val="24"/>
+              </w:rPr>
+              <w:t>8</w:t>
+            </w:r>
+            <w:r>
+              <w:rPr>
+                <w:b/>
+                <w:sz w:val="24"/>
+              </w:rPr>
+              <w:t>．</w:t>
+            </w:r>
+            <w:r>
+              <w:rPr>
+                <w:b/>
+                <w:sz w:val="24"/>
+              </w:rPr>
+              <w:t>测试体系与当前</w:t>
+            </w:r>
+            <w:r>
+              <w:rPr>
+                <w:b/>
+                <w:sz w:val="24"/>
+              </w:rPr>
+              <w:t>sign-off</w:t>
+            </w:r>
+            <w:r>
+              <w:rPr>
+                <w:b/>
+                <w:sz w:val="24"/>
+              </w:rPr>
+              <w:t>结果</w:t>
             </w:r>
           </w:p>
           <w:p>
             <w:pPr>
               <w:spacing w:line="360" w:lineRule="auto"/>
+              <w:ind w:firstLineChars="100" w:firstLine="240"/>
             </w:pPr>
             <w:r>
               <w:rPr>
-                <w:b/>
-                <w:sz w:val="24"/>
-              </w:rPr>
-              <w:t>7</w:t>
-            </w:r>
-            <w:r>
-              <w:rPr>
-                <w:b/>
-                <w:sz w:val="24"/>
-              </w:rPr>
-              <w:t>．对战引擎与异常约定</w:t>
-            </w:r>
-          </w:p>
-          <w:p>
-            <w:pPr>
-              <w:spacing w:line="360" w:lineRule="auto"/>
-            </w:pPr>
-            <w:r>
-              <w:rPr>
-                <w:sz w:val="24"/>
-              </w:rPr>
-              <w:t xml:space="preserve">ai/match.py </w:t>
-            </w:r>
-            <w:r>
-              <w:rPr>
-                <w:sz w:val="24"/>
-              </w:rPr>
-              <w:t>实现完整七盘制对战与状态回放，并明确异常约定：</w:t>
-            </w:r>
-            <w:r>
-              <w:rPr>
-                <w:sz w:val="24"/>
-              </w:rPr>
-              <w:t xml:space="preserve">AI </w:t>
-            </w:r>
-            <w:r>
-              <w:rPr>
-                <w:sz w:val="24"/>
-              </w:rPr>
-              <w:t>抛出未处理异常判负（</w:t>
-            </w:r>
-            <w:r>
-              <w:rPr>
-                <w:sz w:val="24"/>
-              </w:rPr>
-              <w:t>crash loss</w:t>
-            </w:r>
-            <w:r>
-              <w:rPr>
-                <w:sz w:val="24"/>
-              </w:rPr>
-              <w:t>），走法不在当前合法集合判负（</w:t>
-            </w:r>
-            <w:r>
-              <w:rPr>
-                <w:sz w:val="24"/>
-              </w:rPr>
-              <w:t>illegal loss</w:t>
-            </w:r>
-            <w:r>
-              <w:rPr>
-                <w:sz w:val="24"/>
-              </w:rPr>
-              <w:t>），单步超过时限判负（</w:t>
-            </w:r>
-            <w:r>
-              <w:rPr>
-                <w:sz w:val="24"/>
-              </w:rPr>
-              <w:t>timeout loss</w:t>
-            </w:r>
-            <w:r>
-              <w:rPr>
-                <w:sz w:val="24"/>
-              </w:rPr>
-              <w:t>）。完整状态序列化支持回放与现场答辩。</w:t>
-            </w:r>
-          </w:p>
-          <w:p>
-            <w:pPr>
-              <w:spacing w:line="360" w:lineRule="auto"/>
-            </w:pPr>
-            <w:r>
-              <w:rPr>
-                <w:b/>
-                <w:sz w:val="24"/>
-              </w:rPr>
-              <w:t>8</w:t>
-            </w:r>
-            <w:r>
-              <w:rPr>
-                <w:b/>
-                <w:sz w:val="24"/>
-              </w:rPr>
-              <w:t>．测试体系</w:t>
-            </w:r>
-          </w:p>
-          <w:p>
-            <w:pPr>
-              <w:spacing w:line="360" w:lineRule="auto"/>
-            </w:pPr>
-            <w:r>
-              <w:rPr>
-                <w:sz w:val="24"/>
-              </w:rPr>
-              <w:t>tests/ 共 38 个测试文件、约 1000 余条用例，覆盖：规则与吃子（含本方棋子被压出）、骰子映射、走法生成、评估函数各分项、风险估计、Rollout/MCTS/Greedy/Tactical 决策器、对战引擎、计时与异常恢复、GUI 集成。当前 sign-off 复验结果为：pytest 全量执行 428 passed、50 skipped、0 failed、0 errors；smoke_test.py 通过，undo restored: True；scripts/s2_rehearsal.py 通过，Total: 8/8 scenarios passed。真实 Tk GUI 手动演练已于 2026-05-13 完成，21 项全部正常。</w:t>
-            </w:r>
-            <w:r>
-              <w:rPr>
-                <w:sz w:val="24"/>
-              </w:rPr>
-            </w:r>
-            <w:r>
-              <w:rPr>
-                <w:sz w:val="24"/>
-              </w:rPr>
-            </w:r>
-            <w:r>
-              <w:rPr>
-                <w:sz w:val="24"/>
-              </w:rPr>
-            </w:r>
-            <w:r>
-              <w:rPr>
-                <w:sz w:val="24"/>
-              </w:rPr>
-            </w:r>
-            <w:r>
-              <w:rPr>
-                <w:sz w:val="24"/>
-              </w:rPr>
-            </w:r>
-            <w:r>
-              <w:rPr>
-                <w:sz w:val="24"/>
-              </w:rPr>
-            </w:r>
-            <w:r>
-              <w:rPr>
-                <w:sz w:val="24"/>
-              </w:rPr>
-            </w:r>
-            <w:r>
-              <w:rPr>
-                <w:sz w:val="24"/>
-              </w:rPr>
-            </w:r>
-            <w:r>
-              <w:rPr>
-                <w:sz w:val="24"/>
-              </w:rPr>
-            </w:r>
-            <w:r>
-              <w:rPr>
-                <w:sz w:val="24"/>
-              </w:rPr>
-            </w:r>
-            <w:r>
-              <w:rPr>
-                <w:sz w:val="24"/>
-              </w:rPr>
-            </w:r>
-            <w:r>
-              <w:rPr>
-                <w:sz w:val="24"/>
-              </w:rPr>
-            </w:r>
-            <w:r>
-              <w:rPr>
-                <w:sz w:val="24"/>
-              </w:rPr>
-            </w:r>
-            <w:r>
-              <w:rPr>
-                <w:sz w:val="24"/>
-              </w:rPr>
-            </w:r>
-            <w:r>
-              <w:rPr>
-                <w:sz w:val="24"/>
-              </w:rPr>
-            </w:r>
-            <w:r>
-              <w:rPr>
-                <w:sz w:val="24"/>
-              </w:rPr>
-            </w:r>
-            <w:r>
-              <w:rPr>
-                <w:sz w:val="24"/>
-              </w:rPr>
-            </w:r>
-            <w:r>
-              <w:rPr>
-                <w:sz w:val="24"/>
-              </w:rPr>
-            </w:r>
-            <w:r>
-              <w:rPr>
-                <w:sz w:val="24"/>
-              </w:rPr>
-            </w:r>
-            <w:r>
-              <w:rPr>
-                <w:sz w:val="24"/>
-              </w:rPr>
-            </w:r>
-            <w:r>
-              <w:rPr>
-                <w:sz w:val="24"/>
-              </w:rPr>
-            </w:r>
-            <w:r>
-              <w:rPr>
-                <w:sz w:val="24"/>
-              </w:rPr>
-            </w:r>
-            <w:r>
-              <w:rPr>
-                <w:sz w:val="24"/>
-              </w:rPr>
-            </w:r>
-            <w:r>
-              <w:rPr>
-                <w:sz w:val="24"/>
-              </w:rPr>
-            </w:r>
-            <w:r>
-              <w:rPr>
-                <w:sz w:val="24"/>
-              </w:rPr>
-            </w:r>
-            <w:r>
-              <w:rPr>
-                <w:sz w:val="24"/>
-              </w:rPr>
-            </w:r>
-            <w:r>
-              <w:rPr>
-                <w:sz w:val="24"/>
-              </w:rPr>
-            </w:r>
-            <w:r>
-              <w:rPr>
-                <w:sz w:val="24"/>
-              </w:rPr>
-            </w:r>
-            <w:r>
-              <w:rPr>
-                <w:sz w:val="24"/>
-              </w:rPr>
-            </w:r>
-            <w:r>
-              <w:rPr>
-                <w:sz w:val="24"/>
-              </w:rPr>
-            </w:r>
-            <w:r>
-              <w:rPr>
-                <w:sz w:val="24"/>
-              </w:rPr>
-            </w:r>
-            <w:r>
-              <w:rPr>
-                <w:sz w:val="24"/>
-              </w:rPr>
-            </w:r>
-            <w:r>
-              <w:rPr>
-                <w:sz w:val="24"/>
-              </w:rPr>
-            </w:r>
-            <w:r>
-              <w:rPr>
-                <w:sz w:val="24"/>
-              </w:rPr>
-            </w:r>
-            <w:r>
-              <w:rPr>
-                <w:sz w:val="24"/>
-              </w:rPr>
-            </w:r>
-            <w:r>
-              <w:rPr>
-                <w:sz w:val="24"/>
-              </w:rPr>
+                <w:sz w:val="24"/>
+              </w:rPr>
+              <w:t xml:space="preserve">tests/ </w:t>
+            </w:r>
+            <w:r>
+              <w:rPr>
+                <w:sz w:val="24"/>
+              </w:rPr>
+              <w:t>覆盖规则与吃子（含本方棋子被压出）、骰子映射、走法生成、评估函数各分项、风险估计、</w:t>
+            </w:r>
+            <w:r>
+              <w:rPr>
+                <w:sz w:val="24"/>
+              </w:rPr>
+              <w:t>Rollout/MCTS/Greedy/Tactical</w:t>
+            </w:r>
+            <w:r>
+              <w:rPr>
+                <w:sz w:val="24"/>
+              </w:rPr>
+              <w:t>决策器、开局搜索、布局对比、对战引擎、计时与异常恢复、</w:t>
+            </w:r>
+            <w:r>
+              <w:rPr>
+                <w:sz w:val="24"/>
+              </w:rPr>
+              <w:t>GUI</w:t>
+            </w:r>
+            <w:r>
+              <w:rPr>
+                <w:sz w:val="24"/>
+              </w:rPr>
+              <w:t>集成等内容。当前最新复验结果为：</w:t>
+            </w:r>
+            <w:r>
+              <w:rPr>
+                <w:sz w:val="24"/>
+              </w:rPr>
+              <w:t>pytest</w:t>
+            </w:r>
+            <w:r>
+              <w:rPr>
+                <w:sz w:val="24"/>
+              </w:rPr>
+              <w:t>全量执行</w:t>
+            </w:r>
+            <w:r>
+              <w:rPr>
+                <w:sz w:val="24"/>
+              </w:rPr>
+              <w:t>541 passed</w:t>
+            </w:r>
+            <w:r>
+              <w:rPr>
+                <w:sz w:val="24"/>
+              </w:rPr>
+              <w:t>、</w:t>
+            </w:r>
+            <w:r>
+              <w:rPr>
+                <w:sz w:val="24"/>
+              </w:rPr>
+              <w:t>0 failed</w:t>
+            </w:r>
+            <w:r>
+              <w:rPr>
+                <w:sz w:val="24"/>
+              </w:rPr>
+              <w:t>、</w:t>
+            </w:r>
+            <w:r>
+              <w:rPr>
+                <w:sz w:val="24"/>
+              </w:rPr>
+              <w:t>0 errors</w:t>
+            </w:r>
+            <w:r>
+              <w:rPr>
+                <w:sz w:val="24"/>
+              </w:rPr>
+              <w:t>；</w:t>
+            </w:r>
+            <w:r>
+              <w:rPr>
+                <w:sz w:val="24"/>
+              </w:rPr>
+              <w:t>smoke_test.py</w:t>
+            </w:r>
+            <w:r>
+              <w:rPr>
+                <w:sz w:val="24"/>
+              </w:rPr>
+              <w:t>通过，</w:t>
+            </w:r>
+            <w:r>
+              <w:rPr>
+                <w:sz w:val="24"/>
+              </w:rPr>
+              <w:t>undo restored: True</w:t>
+            </w:r>
+            <w:r>
+              <w:rPr>
+                <w:sz w:val="24"/>
+              </w:rPr>
+              <w:t>；</w:t>
+            </w:r>
+            <w:r>
+              <w:rPr>
+                <w:sz w:val="24"/>
+              </w:rPr>
+              <w:t>scripts/s2_rehearsal.py</w:t>
+            </w:r>
+            <w:r>
+              <w:rPr>
+                <w:sz w:val="24"/>
+              </w:rPr>
+              <w:t>历史复验通过，</w:t>
+            </w:r>
+            <w:r>
+              <w:rPr>
+                <w:sz w:val="24"/>
+              </w:rPr>
+              <w:t>Total: 8/8 scenarios passed</w:t>
+            </w:r>
+            <w:r>
+              <w:rPr>
+                <w:sz w:val="24"/>
+              </w:rPr>
+              <w:t>；</w:t>
+            </w:r>
+            <w:r>
+              <w:t xml:space="preserve"> </w:t>
             </w:r>
           </w:p>
         </w:tc>
       </w:tr>
     </w:tbl>
-    <w:p>
-      <w:pPr>
-        <w:spacing w:beforeLines="50" w:before="156"/>
-        <w:rPr>
-          <w:b/>
-          <w:sz w:val="28"/>
-          <w:szCs w:val="28"/>
-        </w:rPr>
-      </w:pPr>
-    </w:p>
     <w:p>
       <w:pPr>
         <w:spacing w:beforeLines="50" w:before="156"/>
@@ -4450,13 +4803,37 @@
           <w:szCs w:val="28"/>
         </w:rPr>
       </w:pPr>
-      <w:r>
+    </w:p>
+    <w:p>
+      <w:pPr>
+        <w:spacing w:beforeLines="50" w:before="156"/>
+        <w:ind w:left="360" w:hangingChars="128" w:hanging="360"/>
         <w:rPr>
           <w:rFonts w:hint="eastAsia"/>
           <w:b/>
           <w:sz w:val="28"/>
           <w:szCs w:val="28"/>
         </w:rPr>
+      </w:pPr>
+    </w:p>
+    <w:p>
+      <w:pPr>
+        <w:spacing w:beforeLines="50" w:before="156"/>
+        <w:ind w:left="360" w:hangingChars="128" w:hanging="360"/>
+        <w:rPr>
+          <w:b/>
+          <w:sz w:val="28"/>
+          <w:szCs w:val="28"/>
+        </w:rPr>
+      </w:pPr>
+      <w:r>
+        <w:rPr>
+          <w:rFonts w:hint="eastAsia"/>
+          <w:b/>
+          <w:sz w:val="28"/>
+          <w:szCs w:val="28"/>
+        </w:rPr>
+        <w:lastRenderedPageBreak/>
         <w:t>四、程序参考文献</w:t>
       </w:r>
     </w:p>
@@ -4591,60 +4968,6 @@
               </w:rPr>
               <w:t xml:space="preserve">: 2019-08-13. </w:t>
             </w:r>
-            <w:r>
-              <w:rPr>
-                <w:sz w:val="24"/>
-              </w:rPr>
-              <w:t>本程序在</w:t>
-            </w:r>
-            <w:r>
-              <w:rPr>
-                <w:sz w:val="24"/>
-              </w:rPr>
-              <w:t xml:space="preserve"> MCTSAI </w:t>
-            </w:r>
-            <w:r>
-              <w:rPr>
-                <w:sz w:val="24"/>
-              </w:rPr>
-              <w:t>阶段参考该同棋种专利的</w:t>
-            </w:r>
-            <w:r>
-              <w:rPr>
-                <w:sz w:val="24"/>
-              </w:rPr>
-              <w:t xml:space="preserve"> APV-MCTS </w:t>
-            </w:r>
-            <w:r>
-              <w:rPr>
-                <w:sz w:val="24"/>
-              </w:rPr>
-              <w:t>思想（显式</w:t>
-            </w:r>
-            <w:r>
-              <w:rPr>
-                <w:sz w:val="24"/>
-              </w:rPr>
-              <w:t xml:space="preserve"> MCTS </w:t>
-            </w:r>
-            <w:r>
-              <w:rPr>
-                <w:sz w:val="24"/>
-              </w:rPr>
-              <w:t>树结构</w:t>
-            </w:r>
-            <w:r>
-              <w:rPr>
-                <w:sz w:val="24"/>
-              </w:rPr>
-              <w:t xml:space="preserve"> + </w:t>
-            </w:r>
-            <w:r>
-              <w:rPr>
-                <w:sz w:val="24"/>
-              </w:rPr>
-              <w:t>叶节点先验估值），未实现其神经网络训练部分。</w:t>
-            </w:r>
           </w:p>
           <w:p>
             <w:pPr>
@@ -4850,41 +5173,42 @@
           </w:tcPr>
           <w:p>
             <w:pPr>
+              <w:spacing w:line="360" w:lineRule="auto"/>
+              <w:ind w:firstLineChars="100" w:firstLine="210"/>
+              <w:rPr>
+                <w:sz w:val="24"/>
+              </w:rPr>
+            </w:pPr>
+            <w:r>
               <w:rPr>
                 <w:szCs w:val="21"/>
               </w:rPr>
-            </w:pPr>
-            <w:r>
-              <w:rPr>
-                <w:rFonts w:hint="eastAsia"/>
+              <w:t>该生在本项目开发过程中态度认真，能够围绕爱恩斯坦棋比赛规则进行较为系统的分析与实现。程序采用模块化设计，规则引擎、</w:t>
+            </w:r>
+            <w:r>
+              <w:rPr>
                 <w:szCs w:val="21"/>
               </w:rPr>
-              <w:t>对程序的历程、关键技术、创新性工作和真实性等进行评价。</w:t>
-            </w:r>
-          </w:p>
-          <w:p>
-            <w:pPr>
-              <w:spacing w:line="360" w:lineRule="auto"/>
-              <w:rPr>
-                <w:sz w:val="24"/>
-              </w:rPr>
-            </w:pPr>
-          </w:p>
-          <w:p>
-            <w:pPr>
-              <w:spacing w:line="360" w:lineRule="auto"/>
-              <w:rPr>
-                <w:sz w:val="24"/>
-              </w:rPr>
-            </w:pPr>
-          </w:p>
-          <w:p>
-            <w:pPr>
-              <w:spacing w:line="360" w:lineRule="auto"/>
-              <w:rPr>
-                <w:sz w:val="24"/>
-              </w:rPr>
-            </w:pPr>
+              <w:t>AI</w:t>
+            </w:r>
+            <w:r>
+              <w:rPr>
+                <w:szCs w:val="21"/>
+              </w:rPr>
+              <w:t>决策和图形界面分工清晰，具备离线运行、棋局记录、计时、撤销、</w:t>
+            </w:r>
+            <w:r>
+              <w:rPr>
+                <w:szCs w:val="21"/>
+              </w:rPr>
+              <w:t>AI</w:t>
+            </w:r>
+            <w:r>
+              <w:rPr>
+                <w:szCs w:val="21"/>
+              </w:rPr>
+              <w:t>推荐等实用功能。开发过程中注重测试验证和数据分析，能够通过自动化测试、对战评测和参数复验不断改进程序稳定性与智能水平。整体来看，该作品功能较完整，工程结构清晰，具有一定的创新性和实际参赛价值，达到了程序设计说明书及比赛项目的要求。</w:t>
+            </w:r>
           </w:p>
           <w:p>
             <w:pPr>
@@ -4991,13 +5315,20 @@
                 <w:rFonts w:hint="eastAsia"/>
                 <w:sz w:val="24"/>
               </w:rPr>
-              <w:t xml:space="preserve">             </w:t>
+              <w:t xml:space="preserve">           </w:t>
             </w:r>
             <w:r>
               <w:rPr>
                 <w:rFonts w:hint="eastAsia"/>
                 <w:sz w:val="24"/>
               </w:rPr>
+              <w:t>2026</w:t>
+            </w:r>
+            <w:r>
+              <w:rPr>
+                <w:rFonts w:hint="eastAsia"/>
+                <w:sz w:val="24"/>
+              </w:rPr>
               <w:t>年</w:t>
             </w:r>
             <w:r>
@@ -5005,13 +5336,27 @@
                 <w:rFonts w:hint="eastAsia"/>
                 <w:sz w:val="24"/>
               </w:rPr>
-              <w:t xml:space="preserve">     </w:t>
+              <w:t xml:space="preserve">  </w:t>
             </w:r>
             <w:r>
               <w:rPr>
                 <w:rFonts w:hint="eastAsia"/>
                 <w:sz w:val="24"/>
               </w:rPr>
+              <w:t>5</w:t>
+            </w:r>
+            <w:r>
+              <w:rPr>
+                <w:rFonts w:hint="eastAsia"/>
+                <w:sz w:val="24"/>
+              </w:rPr>
+              <w:t xml:space="preserve">  </w:t>
+            </w:r>
+            <w:r>
+              <w:rPr>
+                <w:rFonts w:hint="eastAsia"/>
+                <w:sz w:val="24"/>
+              </w:rPr>
               <w:t>月</w:t>
             </w:r>
             <w:r>
@@ -5019,7 +5364,21 @@
                 <w:rFonts w:hint="eastAsia"/>
                 <w:sz w:val="24"/>
               </w:rPr>
-              <w:t xml:space="preserve">     </w:t>
+              <w:t xml:space="preserve">  </w:t>
+            </w:r>
+            <w:r>
+              <w:rPr>
+                <w:rFonts w:hint="eastAsia"/>
+                <w:sz w:val="24"/>
+              </w:rPr>
+              <w:t>15</w:t>
+            </w:r>
+            <w:r>
+              <w:rPr>
+                <w:rFonts w:hint="eastAsia"/>
+                <w:sz w:val="24"/>
+              </w:rPr>
+              <w:t xml:space="preserve"> </w:t>
             </w:r>
             <w:r>
               <w:rPr>
@@ -5665,6 +6024,7 @@
     </w:pPr>
     <w:rPr>
       <w:rFonts w:ascii="Times New Roman" w:eastAsia="宋体" w:hAnsi="Times New Roman" w:cs="Times New Roman"/>
+      <w:noProof/>
       <w:kern w:val="2"/>
       <w:sz w:val="21"/>
       <w:szCs w:val="24"/>
@@ -5673,7 +6033,6 @@
   <w:style w:type="character" w:default="1" w:styleId="a0">
     <w:name w:val="Default Paragraph Font"/>
     <w:uiPriority w:val="1"/>
-    <w:semiHidden/>
     <w:unhideWhenUsed/>
   </w:style>
   <w:style w:type="table" w:default="1" w:styleId="a1">

</xml_diff>